<commit_message>
style: simplify Buoi 9 docx and format with Times New Roman 13pt black
</commit_message>
<xml_diff>
--- a/word/Buoi9_LeVanHoaiRin.docx
+++ b/word/Buoi9_LeVanHoaiRin.docx
@@ -9,108 +9,52 @@
       </w:pPr>
       <w:r>
         <w:rPr>
-          <w:rFonts w:ascii="Arial" w:hAnsi="Arial"/>
+          <w:rFonts w:ascii="Times New Roman" w:hAnsi="Times New Roman"/>
           <w:b/>
-          <w:color w:val="555555"/>
-          <w:sz w:val="22"/>
+          <w:color w:val="000000"/>
+          <w:sz w:val="26"/>
         </w:rPr>
-        <w:t>BÀI TẬP THỰC HÀNH - CÔNG CỤ &amp; PHƯƠNG PHÁP THIẾT KẾ - QUẢN LÝ PHẦN MỀM</w:t>
+        <w:t>BÀI TẬP THỰC HÀNH - CÔNG CỤ &amp; PP THIẾT KẾ - QUẢN LÝ PHẦN MỀM</w:t>
         <w:br/>
       </w:r>
       <w:r>
         <w:rPr>
-          <w:rFonts w:ascii="Arial" w:hAnsi="Arial"/>
+          <w:rFonts w:ascii="Times New Roman" w:hAnsi="Times New Roman"/>
           <w:b/>
-          <w:color w:val="1F4E79"/>
+          <w:color w:val="000000"/>
           <w:sz w:val="32"/>
         </w:rPr>
-        <w:t>BÁO CÁO BUỔI 9: TÌM HIỂU VỀ GITHUB VÀ HỆ THỐNG CÂU LỆNH GIT</w:t>
+        <w:t>BÁO CÁO BUỔI 9: TỔNG QUAN GITHUB &amp; CÁC CÂU LỆNH GIT</w:t>
       </w:r>
     </w:p>
     <w:p>
       <w:pPr>
-        <w:spacing w:after="320"/>
+        <w:spacing w:after="280"/>
         <w:jc w:val="center"/>
       </w:pPr>
       <w:r>
         <w:rPr>
-          <w:rFonts w:ascii="Arial" w:hAnsi="Arial"/>
+          <w:rFonts w:ascii="Times New Roman" w:hAnsi="Times New Roman"/>
           <w:i/>
-          <w:color w:val="444444"/>
-          <w:sz w:val="21"/>
+          <w:color w:val="000000"/>
+          <w:sz w:val="26"/>
         </w:rPr>
-        <w:t>Sinh viên thực hiện: Lê Văn Hoài Rin  |  Buổi: Buổi 9</w:t>
-        <w:br/>
-        <w:t>Chủ đề: Tổng quan GitHub &amp; Hệ thống lệnh Git dùng để làm gì</w:t>
+        <w:t>Sinh viên thực hiện: Lê Văn Hoài Rin  |  Buổi: 9</w:t>
       </w:r>
     </w:p>
     <w:p>
       <w:pPr>
         <w:keepNext/>
-        <w:spacing w:before="320" w:after="120"/>
+        <w:spacing w:before="280" w:after="80"/>
       </w:pPr>
       <w:r>
         <w:rPr>
-          <w:rFonts w:ascii="Arial" w:hAnsi="Arial"/>
+          <w:rFonts w:ascii="Times New Roman" w:hAnsi="Times New Roman"/>
           <w:b/>
-          <w:color w:val="1F4E79"/>
-          <w:sz w:val="27"/>
+          <w:color w:val="000000"/>
+          <w:sz w:val="30"/>
         </w:rPr>
         <w:t>1. TỔNG QUAN VỀ GIT VÀ GITHUB</w:t>
-      </w:r>
-    </w:p>
-    <w:p>
-      <w:pPr>
-        <w:keepNext/>
-        <w:spacing w:before="240" w:after="80"/>
-      </w:pPr>
-      <w:r>
-        <w:rPr>
-          <w:rFonts w:ascii="Arial" w:hAnsi="Arial"/>
-          <w:b/>
-          <w:color w:val="2E75B6"/>
-          <w:sz w:val="23"/>
-        </w:rPr>
-        <w:t>1.1. Git là gì?</w:t>
-      </w:r>
-    </w:p>
-    <w:p>
-      <w:pPr>
-        <w:spacing w:before="0" w:after="120" w:line="288" w:lineRule="auto"/>
-      </w:pPr>
-      <w:r>
-        <w:rPr>
-          <w:rFonts w:ascii="Arial" w:hAnsi="Arial"/>
-          <w:color w:val="222222"/>
-          <w:sz w:val="21"/>
-        </w:rPr>
-        <w:t>Git là một Hệ thống Quản lý Phiên bản Phân tán (Distributed Version Control System - DVCS) mã nguồn mở và hoàn toàn miễn phí, được sáng tạo bởi Linus Torvalds vào năm 2005. Git được thiết kế để xử lý từ các dự án nhỏ đến những dự án mã nguồn khổng lồ với tốc độ vượt trội và hiệu suất tối ưu.</w:t>
-      </w:r>
-    </w:p>
-    <w:p>
-      <w:pPr>
-        <w:spacing w:before="0" w:after="120" w:line="288" w:lineRule="auto"/>
-      </w:pPr>
-      <w:r>
-        <w:rPr>
-          <w:rFonts w:ascii="Arial" w:hAnsi="Arial"/>
-          <w:color w:val="222222"/>
-          <w:sz w:val="21"/>
-        </w:rPr>
-        <w:t>Về bản chất, Git giúp lưu trữ lịch sử thay đổi của từng file theo thời gian. Bất kỳ ai trong nhóm cũng có một bản sao hoàn chỉnh của toàn bộ kho lưu trữ (bao gồm đầy đủ lịch sử commit) ngay trên máy cục bộ, cho phép làm việc hoàn toàn không cần kết nối mạng Internet.</w:t>
-      </w:r>
-    </w:p>
-    <w:p>
-      <w:pPr>
-        <w:spacing w:before="0" w:after="120" w:line="288" w:lineRule="auto"/>
-      </w:pPr>
-      <w:r>
-        <w:rPr>
-          <w:rFonts w:ascii="Arial" w:hAnsi="Arial"/>
-          <w:color w:val="222222"/>
-          <w:sz w:val="21"/>
-        </w:rPr>
-        <w:t>Kiến trúc dữ liệu của Git chia làm 3 phân vùng cốt lõi (Three States / Three Trees):</w:t>
       </w:r>
     </w:p>
     <w:p>
@@ -120,19 +64,20 @@
       </w:pPr>
       <w:r>
         <w:rPr>
-          <w:rFonts w:ascii="Arial" w:hAnsi="Arial"/>
+          <w:rFonts w:ascii="Times New Roman" w:hAnsi="Times New Roman"/>
           <w:b/>
-          <w:sz w:val="21"/>
+          <w:color w:val="000000"/>
+          <w:sz w:val="26"/>
         </w:rPr>
-        <w:t xml:space="preserve">1. Working Directory (Thư mục làm việc): </w:t>
+        <w:t xml:space="preserve">Git: </w:t>
       </w:r>
       <w:r>
         <w:rPr>
-          <w:rFonts w:ascii="Arial" w:hAnsi="Arial"/>
-          <w:color w:val="222222"/>
-          <w:sz w:val="21"/>
+          <w:rFonts w:ascii="Times New Roman" w:hAnsi="Times New Roman"/>
+          <w:color w:val="000000"/>
+          <w:sz w:val="26"/>
         </w:rPr>
-        <w:t>Nơi lập trình viên trực tiếp tạo mới, chỉnh sửa hoặc xóa mã nguồn trên ổ đĩa.</w:t>
+        <w:t>Hệ thống quản lý phiên bản phân tán (DVCS) cài đặt trực tiếp trên máy tính. Dùng để ghi lại lịch sử thay đổi file, hoàn tác code khi có lỗi, và phân nhánh phát triển độc lập.</w:t>
       </w:r>
     </w:p>
     <w:p>
@@ -142,220 +87,35 @@
       </w:pPr>
       <w:r>
         <w:rPr>
-          <w:rFonts w:ascii="Arial" w:hAnsi="Arial"/>
+          <w:rFonts w:ascii="Times New Roman" w:hAnsi="Times New Roman"/>
           <w:b/>
-          <w:sz w:val="21"/>
+          <w:color w:val="000000"/>
+          <w:sz w:val="26"/>
         </w:rPr>
-        <w:t xml:space="preserve">2. Staging Area (Khu vực tạm lưu / Index): </w:t>
+        <w:t xml:space="preserve">GitHub: </w:t>
       </w:r>
       <w:r>
         <w:rPr>
-          <w:rFonts w:ascii="Arial" w:hAnsi="Arial"/>
-          <w:color w:val="222222"/>
-          <w:sz w:val="21"/>
+          <w:rFonts w:ascii="Times New Roman" w:hAnsi="Times New Roman"/>
+          <w:color w:val="000000"/>
+          <w:sz w:val="26"/>
         </w:rPr>
-        <w:t>Vùng đệm lưu trữ danh sách các file đã được chọn lựa chuẩn bị cho lần ghi nhận kế tiếp.</w:t>
-      </w:r>
-    </w:p>
-    <w:p>
-      <w:pPr>
-        <w:pStyle w:val="ListBullet"/>
-        <w:spacing w:before="0" w:after="60" w:line="276" w:lineRule="auto"/>
-      </w:pPr>
-      <w:r>
-        <w:rPr>
-          <w:rFonts w:ascii="Arial" w:hAnsi="Arial"/>
-          <w:b/>
-          <w:sz w:val="21"/>
-        </w:rPr>
-        <w:t xml:space="preserve">3. Local Repository (Kho lưu trữ cục bộ): </w:t>
-      </w:r>
-      <w:r>
-        <w:rPr>
-          <w:rFonts w:ascii="Arial" w:hAnsi="Arial"/>
-          <w:color w:val="222222"/>
-          <w:sz w:val="21"/>
-        </w:rPr>
-        <w:t>Nơi Git lưu trữ an toàn các snapshot (ảnh chụp trạng thái) của dự án trong thư mục ẩn .git.</w:t>
+        <w:t>Nền tảng đám mây lưu trữ Git Repository trực tuyến. Cung cấp công cụ làm việc nhóm như Pull Request (review code), Issue (quản lý lỗi/tác vụ), và GitHub Actions (CI/CD tự động).</w:t>
       </w:r>
     </w:p>
     <w:p>
       <w:pPr>
         <w:keepNext/>
-        <w:spacing w:before="240" w:after="80"/>
+        <w:spacing w:before="200" w:after="60"/>
       </w:pPr>
       <w:r>
         <w:rPr>
-          <w:rFonts w:ascii="Arial" w:hAnsi="Arial"/>
+          <w:rFonts w:ascii="Times New Roman" w:hAnsi="Times New Roman"/>
           <w:b/>
-          <w:color w:val="2E75B6"/>
-          <w:sz w:val="23"/>
+          <w:color w:val="000000"/>
+          <w:sz w:val="27"/>
         </w:rPr>
-        <w:t>1.2. GitHub là gì?</w:t>
-      </w:r>
-    </w:p>
-    <w:p>
-      <w:pPr>
-        <w:spacing w:before="0" w:after="120" w:line="288" w:lineRule="auto"/>
-      </w:pPr>
-      <w:r>
-        <w:rPr>
-          <w:rFonts w:ascii="Arial" w:hAnsi="Arial"/>
-          <w:color w:val="222222"/>
-          <w:sz w:val="21"/>
-        </w:rPr>
-        <w:t>GitHub là dịch vụ lưu trữ trực tuyến trên nền tảng đám mây (Cloud Hosting Service) dành cho các kho lưu trữ mã nguồn sử dụng Git. Thành lập năm 2008 và được Microsoft mua lại vào năm 2018, GitHub hiện là 'ngôi nhà' của hàng trăm triệu lập trình viên trên toàn cầu.</w:t>
-      </w:r>
-    </w:p>
-    <w:p>
-      <w:pPr>
-        <w:spacing w:before="0" w:after="120" w:line="288" w:lineRule="auto"/>
-      </w:pPr>
-      <w:r>
-        <w:rPr>
-          <w:rFonts w:ascii="Arial" w:hAnsi="Arial"/>
-          <w:color w:val="222222"/>
-          <w:sz w:val="21"/>
-        </w:rPr>
-        <w:t>GitHub cung cấp hệ sinh thái cộng tác toàn diện mở rộng trên nền Git:</w:t>
-      </w:r>
-    </w:p>
-    <w:p>
-      <w:pPr>
-        <w:pStyle w:val="ListBullet"/>
-        <w:spacing w:before="0" w:after="60" w:line="276" w:lineRule="auto"/>
-      </w:pPr>
-      <w:r>
-        <w:rPr>
-          <w:rFonts w:ascii="Arial" w:hAnsi="Arial"/>
-          <w:b/>
-          <w:sz w:val="21"/>
-        </w:rPr>
-        <w:t xml:space="preserve">Lưu trữ Remote Repository: </w:t>
-      </w:r>
-      <w:r>
-        <w:rPr>
-          <w:rFonts w:ascii="Arial" w:hAnsi="Arial"/>
-          <w:color w:val="222222"/>
-          <w:sz w:val="21"/>
-        </w:rPr>
-        <w:t>Lưu trữ mã nguồn an toàn trên đám mây, cho phép làm việc nhóm từ bất cứ đâu.</w:t>
-      </w:r>
-    </w:p>
-    <w:p>
-      <w:pPr>
-        <w:pStyle w:val="ListBullet"/>
-        <w:spacing w:before="0" w:after="60" w:line="276" w:lineRule="auto"/>
-      </w:pPr>
-      <w:r>
-        <w:rPr>
-          <w:rFonts w:ascii="Arial" w:hAnsi="Arial"/>
-          <w:b/>
-          <w:sz w:val="21"/>
-        </w:rPr>
-        <w:t xml:space="preserve">Pull Request (PR): </w:t>
-      </w:r>
-      <w:r>
-        <w:rPr>
-          <w:rFonts w:ascii="Arial" w:hAnsi="Arial"/>
-          <w:color w:val="222222"/>
-          <w:sz w:val="21"/>
-        </w:rPr>
-        <w:t>Tính năng trung tâm cho phép các thành viên đề xuất gộp code, bình luận, rà soát từng dòng code (Code Review) và thảo luận trước khi đưa vào sản phẩm.</w:t>
-      </w:r>
-    </w:p>
-    <w:p>
-      <w:pPr>
-        <w:pStyle w:val="ListBullet"/>
-        <w:spacing w:before="0" w:after="60" w:line="276" w:lineRule="auto"/>
-      </w:pPr>
-      <w:r>
-        <w:rPr>
-          <w:rFonts w:ascii="Arial" w:hAnsi="Arial"/>
-          <w:b/>
-          <w:sz w:val="21"/>
-        </w:rPr>
-        <w:t xml:space="preserve">Issues &amp; Project Boards: </w:t>
-      </w:r>
-      <w:r>
-        <w:rPr>
-          <w:rFonts w:ascii="Arial" w:hAnsi="Arial"/>
-          <w:color w:val="222222"/>
-          <w:sz w:val="21"/>
-        </w:rPr>
-        <w:t>Theo dõi các lỗi phát sinh, giao việc, phân công nhiệm vụ và quản lý tiến độ dự án theo mô hình Agile/Scrum hoặc Kanban.</w:t>
-      </w:r>
-    </w:p>
-    <w:p>
-      <w:pPr>
-        <w:pStyle w:val="ListBullet"/>
-        <w:spacing w:before="0" w:after="60" w:line="276" w:lineRule="auto"/>
-      </w:pPr>
-      <w:r>
-        <w:rPr>
-          <w:rFonts w:ascii="Arial" w:hAnsi="Arial"/>
-          <w:b/>
-          <w:sz w:val="21"/>
-        </w:rPr>
-        <w:t xml:space="preserve">GitHub Actions: </w:t>
-      </w:r>
-      <w:r>
-        <w:rPr>
-          <w:rFonts w:ascii="Arial" w:hAnsi="Arial"/>
-          <w:color w:val="222222"/>
-          <w:sz w:val="21"/>
-        </w:rPr>
-        <w:t>Nền tảng tự động hóa CI/CD (Tích hợp liên tục và Triển khai liên tục) mạnh mẽ tích hợp sẵn.</w:t>
-      </w:r>
-    </w:p>
-    <w:p>
-      <w:pPr>
-        <w:pStyle w:val="ListBullet"/>
-        <w:spacing w:before="0" w:after="60" w:line="276" w:lineRule="auto"/>
-      </w:pPr>
-      <w:r>
-        <w:rPr>
-          <w:rFonts w:ascii="Arial" w:hAnsi="Arial"/>
-          <w:b/>
-          <w:sz w:val="21"/>
-        </w:rPr>
-        <w:t xml:space="preserve">Bảo mật &amp; Quản trị nhóm: </w:t>
-      </w:r>
-      <w:r>
-        <w:rPr>
-          <w:rFonts w:ascii="Arial" w:hAnsi="Arial"/>
-          <w:color w:val="222222"/>
-          <w:sz w:val="21"/>
-        </w:rPr>
-        <w:t>Tự động phát hiện lỗ hổng trong thư viện, cảnh báo rò rỉ secret key/token và phân quyền truy cập chặt chẽ.</w:t>
-      </w:r>
-    </w:p>
-    <w:p>
-      <w:pPr>
-        <w:keepNext/>
-        <w:spacing w:before="240" w:after="80"/>
-      </w:pPr>
-      <w:r>
-        <w:rPr>
-          <w:rFonts w:ascii="Arial" w:hAnsi="Arial"/>
-          <w:b/>
-          <w:color w:val="2E75B6"/>
-          <w:sz w:val="23"/>
-        </w:rPr>
-        <w:t>1.3. Bảng so sánh chi tiết giữa Git và GitHub</w:t>
-      </w:r>
-    </w:p>
-    <w:p>
-      <w:pPr>
-        <w:spacing w:before="0" w:after="120" w:line="288" w:lineRule="auto"/>
-      </w:pPr>
-      <w:r>
-        <w:rPr>
-          <w:rFonts w:ascii="Arial" w:hAnsi="Arial"/>
-          <w:color w:val="222222"/>
-          <w:sz w:val="21"/>
-        </w:rPr>
-        <w:t>Để hiểu đúng bản chất và không nhầm lẫn giữa hai khái niệm, dưới đây là bảng đối chiếu:</w:t>
+        <w:t>Bảng so sánh tóm tắt:</w:t>
       </w:r>
     </w:p>
     <w:tbl>
@@ -365,12 +125,12 @@
         <w:tblLayout w:type="fixed"/>
         <w:tblLook w:firstColumn="1" w:firstRow="1" w:lastColumn="0" w:lastRow="0" w:noHBand="0" w:noVBand="1" w:val="04A0"/>
         <w:tblBorders>
-          <w:top w:val="single" w:sz="4" w:space="0" w:color="D0D7DE"/>
-          <w:bottom w:val="single" w:sz="4" w:space="0" w:color="D0D7DE"/>
-          <w:left w:val="none"/>
-          <w:right w:val="none"/>
-          <w:insideH w:val="single" w:sz="4" w:space="0" w:color="D0D7DE"/>
-          <w:insideV w:val="none"/>
+          <w:top w:val="single" w:sz="4" w:space="0" w:color="000000"/>
+          <w:bottom w:val="single" w:sz="4" w:space="0" w:color="000000"/>
+          <w:left w:val="single" w:sz="4" w:space="0" w:color="000000"/>
+          <w:right w:val="single" w:sz="4" w:space="0" w:color="000000"/>
+          <w:insideH w:val="single" w:sz="4" w:space="0" w:color="000000"/>
+          <w:insideV w:val="single" w:sz="4" w:space="0" w:color="000000"/>
         </w:tblBorders>
       </w:tblPr>
       <w:tblGrid>
@@ -385,12 +145,12 @@
         <w:tc>
           <w:tcPr>
             <w:tcW w:type="dxa" w:w="2160"/>
-            <w:shd w:fill="1F4E79"/>
+            <w:shd w:fill="EEEEEE"/>
             <w:tcMar>
-              <w:top w:w="120" w:type="dxa"/>
-              <w:bottom w:w="120" w:type="dxa"/>
-              <w:left w:w="140" w:type="dxa"/>
-              <w:right w:w="140" w:type="dxa"/>
+              <w:top w:w="100" w:type="dxa"/>
+              <w:bottom w:w="100" w:type="dxa"/>
+              <w:left w:w="120" w:type="dxa"/>
+              <w:right w:w="120" w:type="dxa"/>
             </w:tcMar>
           </w:tcPr>
           <w:p>
@@ -400,10 +160,10 @@
             </w:pPr>
             <w:r>
               <w:rPr>
-                <w:rFonts w:ascii="Arial" w:hAnsi="Arial"/>
+                <w:rFonts w:ascii="Times New Roman" w:hAnsi="Times New Roman"/>
                 <w:b/>
-                <w:color w:val="FFFFFF"/>
-                <w:sz w:val="20"/>
+                <w:color w:val="000000"/>
+                <w:sz w:val="26"/>
               </w:rPr>
               <w:t>Tiêu chí</w:t>
             </w:r>
@@ -412,12 +172,12 @@
         <w:tc>
           <w:tcPr>
             <w:tcW w:type="dxa" w:w="3600"/>
-            <w:shd w:fill="1F4E79"/>
+            <w:shd w:fill="EEEEEE"/>
             <w:tcMar>
-              <w:top w:w="120" w:type="dxa"/>
-              <w:bottom w:w="120" w:type="dxa"/>
-              <w:left w:w="140" w:type="dxa"/>
-              <w:right w:w="140" w:type="dxa"/>
+              <w:top w:w="100" w:type="dxa"/>
+              <w:bottom w:w="100" w:type="dxa"/>
+              <w:left w:w="120" w:type="dxa"/>
+              <w:right w:w="120" w:type="dxa"/>
             </w:tcMar>
           </w:tcPr>
           <w:p>
@@ -426,10 +186,10 @@
             </w:pPr>
             <w:r>
               <w:rPr>
-                <w:rFonts w:ascii="Arial" w:hAnsi="Arial"/>
+                <w:rFonts w:ascii="Times New Roman" w:hAnsi="Times New Roman"/>
                 <w:b/>
-                <w:color w:val="FFFFFF"/>
-                <w:sz w:val="20"/>
+                <w:color w:val="000000"/>
+                <w:sz w:val="26"/>
               </w:rPr>
               <w:t>Git</w:t>
             </w:r>
@@ -438,12 +198,12 @@
         <w:tc>
           <w:tcPr>
             <w:tcW w:type="dxa" w:w="3600"/>
-            <w:shd w:fill="1F4E79"/>
+            <w:shd w:fill="EEEEEE"/>
             <w:tcMar>
-              <w:top w:w="120" w:type="dxa"/>
-              <w:bottom w:w="120" w:type="dxa"/>
-              <w:left w:w="140" w:type="dxa"/>
-              <w:right w:w="140" w:type="dxa"/>
+              <w:top w:w="100" w:type="dxa"/>
+              <w:bottom w:w="100" w:type="dxa"/>
+              <w:left w:w="120" w:type="dxa"/>
+              <w:right w:w="120" w:type="dxa"/>
             </w:tcMar>
           </w:tcPr>
           <w:p>
@@ -452,10 +212,10 @@
             </w:pPr>
             <w:r>
               <w:rPr>
-                <w:rFonts w:ascii="Arial" w:hAnsi="Arial"/>
+                <w:rFonts w:ascii="Times New Roman" w:hAnsi="Times New Roman"/>
                 <w:b/>
-                <w:color w:val="FFFFFF"/>
-                <w:sz w:val="20"/>
+                <w:color w:val="000000"/>
+                <w:sz w:val="26"/>
               </w:rPr>
               <w:t>GitHub</w:t>
             </w:r>
@@ -467,10 +227,10 @@
           <w:tcPr>
             <w:tcW w:type="dxa" w:w="2160"/>
             <w:tcMar>
-              <w:top w:w="100" w:type="dxa"/>
-              <w:bottom w:w="100" w:type="dxa"/>
-              <w:left w:w="140" w:type="dxa"/>
-              <w:right w:w="140" w:type="dxa"/>
+              <w:top w:w="80" w:type="dxa"/>
+              <w:bottom w:w="80" w:type="dxa"/>
+              <w:left w:w="120" w:type="dxa"/>
+              <w:right w:w="120" w:type="dxa"/>
             </w:tcMar>
           </w:tcPr>
           <w:p>
@@ -480,11 +240,11 @@
             </w:pPr>
             <w:r>
               <w:rPr>
-                <w:rFonts w:ascii="Arial" w:hAnsi="Arial"/>
-                <w:color w:val="333333"/>
-                <w:sz w:val="19"/>
+                <w:rFonts w:ascii="Times New Roman" w:hAnsi="Times New Roman"/>
+                <w:color w:val="000000"/>
+                <w:sz w:val="24"/>
               </w:rPr>
-              <w:t>Định nghĩa &amp; Bản chất</w:t>
+              <w:t>Bản chất</w:t>
             </w:r>
           </w:p>
         </w:tc>
@@ -492,10 +252,10 @@
           <w:tcPr>
             <w:tcW w:type="dxa" w:w="3600"/>
             <w:tcMar>
-              <w:top w:w="100" w:type="dxa"/>
-              <w:bottom w:w="100" w:type="dxa"/>
-              <w:left w:w="140" w:type="dxa"/>
-              <w:right w:w="140" w:type="dxa"/>
+              <w:top w:w="80" w:type="dxa"/>
+              <w:bottom w:w="80" w:type="dxa"/>
+              <w:left w:w="120" w:type="dxa"/>
+              <w:right w:w="120" w:type="dxa"/>
             </w:tcMar>
           </w:tcPr>
           <w:p>
@@ -504,11 +264,11 @@
             </w:pPr>
             <w:r>
               <w:rPr>
-                <w:rFonts w:ascii="Arial" w:hAnsi="Arial"/>
-                <w:color w:val="333333"/>
-                <w:sz w:val="19"/>
+                <w:rFonts w:ascii="Times New Roman" w:hAnsi="Times New Roman"/>
+                <w:color w:val="000000"/>
+                <w:sz w:val="24"/>
               </w:rPr>
-              <w:t>Phần mềm quản lý phiên bản phân tán (DVCS)</w:t>
+              <w:t>Phần mềm quản lý phiên bản (chạy máy cục bộ)</w:t>
             </w:r>
           </w:p>
         </w:tc>
@@ -516,10 +276,10 @@
           <w:tcPr>
             <w:tcW w:type="dxa" w:w="3600"/>
             <w:tcMar>
-              <w:top w:w="100" w:type="dxa"/>
-              <w:bottom w:w="100" w:type="dxa"/>
-              <w:left w:w="140" w:type="dxa"/>
-              <w:right w:w="140" w:type="dxa"/>
+              <w:top w:w="80" w:type="dxa"/>
+              <w:bottom w:w="80" w:type="dxa"/>
+              <w:left w:w="120" w:type="dxa"/>
+              <w:right w:w="120" w:type="dxa"/>
             </w:tcMar>
           </w:tcPr>
           <w:p>
@@ -528,11 +288,11 @@
             </w:pPr>
             <w:r>
               <w:rPr>
-                <w:rFonts w:ascii="Arial" w:hAnsi="Arial"/>
-                <w:color w:val="333333"/>
-                <w:sz w:val="19"/>
+                <w:rFonts w:ascii="Times New Roman" w:hAnsi="Times New Roman"/>
+                <w:color w:val="000000"/>
+                <w:sz w:val="24"/>
               </w:rPr>
-              <w:t>Nền tảng đám mây lưu trữ &amp; dịch vụ cộng tác Git</w:t>
+              <w:t>Dịch vụ đám mây lưu trữ repository Git</w:t>
             </w:r>
           </w:p>
         </w:tc>
@@ -541,12 +301,11 @@
         <w:tc>
           <w:tcPr>
             <w:tcW w:type="dxa" w:w="2160"/>
-            <w:shd w:fill="F9FAFB"/>
             <w:tcMar>
-              <w:top w:w="100" w:type="dxa"/>
-              <w:bottom w:w="100" w:type="dxa"/>
-              <w:left w:w="140" w:type="dxa"/>
-              <w:right w:w="140" w:type="dxa"/>
+              <w:top w:w="80" w:type="dxa"/>
+              <w:bottom w:w="80" w:type="dxa"/>
+              <w:left w:w="120" w:type="dxa"/>
+              <w:right w:w="120" w:type="dxa"/>
             </w:tcMar>
           </w:tcPr>
           <w:p>
@@ -556,23 +315,22 @@
             </w:pPr>
             <w:r>
               <w:rPr>
-                <w:rFonts w:ascii="Arial" w:hAnsi="Arial"/>
-                <w:color w:val="333333"/>
-                <w:sz w:val="19"/>
+                <w:rFonts w:ascii="Times New Roman" w:hAnsi="Times New Roman"/>
+                <w:color w:val="000000"/>
+                <w:sz w:val="24"/>
               </w:rPr>
-              <w:t>Môi trường thực thi</w:t>
+              <w:t>Kết nối mạng</w:t>
             </w:r>
           </w:p>
         </w:tc>
         <w:tc>
           <w:tcPr>
             <w:tcW w:type="dxa" w:w="3600"/>
-            <w:shd w:fill="F9FAFB"/>
             <w:tcMar>
-              <w:top w:w="100" w:type="dxa"/>
-              <w:bottom w:w="100" w:type="dxa"/>
-              <w:left w:w="140" w:type="dxa"/>
-              <w:right w:w="140" w:type="dxa"/>
+              <w:top w:w="80" w:type="dxa"/>
+              <w:bottom w:w="80" w:type="dxa"/>
+              <w:left w:w="120" w:type="dxa"/>
+              <w:right w:w="120" w:type="dxa"/>
             </w:tcMar>
           </w:tcPr>
           <w:p>
@@ -581,23 +339,22 @@
             </w:pPr>
             <w:r>
               <w:rPr>
-                <w:rFonts w:ascii="Arial" w:hAnsi="Arial"/>
-                <w:color w:val="333333"/>
-                <w:sz w:val="19"/>
+                <w:rFonts w:ascii="Times New Roman" w:hAnsi="Times New Roman"/>
+                <w:color w:val="000000"/>
+                <w:sz w:val="24"/>
               </w:rPr>
-              <w:t>Cài đặt &amp; chạy trực tiếp trên máy tính cá nhân (Local)</w:t>
+              <w:t>Offline hoàn toàn</w:t>
             </w:r>
           </w:p>
         </w:tc>
         <w:tc>
           <w:tcPr>
             <w:tcW w:type="dxa" w:w="3600"/>
-            <w:shd w:fill="F9FAFB"/>
             <w:tcMar>
-              <w:top w:w="100" w:type="dxa"/>
-              <w:bottom w:w="100" w:type="dxa"/>
-              <w:left w:w="140" w:type="dxa"/>
-              <w:right w:w="140" w:type="dxa"/>
+              <w:top w:w="80" w:type="dxa"/>
+              <w:bottom w:w="80" w:type="dxa"/>
+              <w:left w:w="120" w:type="dxa"/>
+              <w:right w:w="120" w:type="dxa"/>
             </w:tcMar>
           </w:tcPr>
           <w:p>
@@ -606,11 +363,11 @@
             </w:pPr>
             <w:r>
               <w:rPr>
-                <w:rFonts w:ascii="Arial" w:hAnsi="Arial"/>
-                <w:color w:val="333333"/>
-                <w:sz w:val="19"/>
+                <w:rFonts w:ascii="Times New Roman" w:hAnsi="Times New Roman"/>
+                <w:color w:val="000000"/>
+                <w:sz w:val="24"/>
               </w:rPr>
-              <w:t>Hoạt động trên máy chủ đám mây (Cloud / Web App)</w:t>
+              <w:t>Cần kết nối Internet để đồng bộ</w:t>
             </w:r>
           </w:p>
         </w:tc>
@@ -620,10 +377,10 @@
           <w:tcPr>
             <w:tcW w:type="dxa" w:w="2160"/>
             <w:tcMar>
-              <w:top w:w="100" w:type="dxa"/>
-              <w:bottom w:w="100" w:type="dxa"/>
-              <w:left w:w="140" w:type="dxa"/>
-              <w:right w:w="140" w:type="dxa"/>
+              <w:top w:w="80" w:type="dxa"/>
+              <w:bottom w:w="80" w:type="dxa"/>
+              <w:left w:w="120" w:type="dxa"/>
+              <w:right w:w="120" w:type="dxa"/>
             </w:tcMar>
           </w:tcPr>
           <w:p>
@@ -633,11 +390,11 @@
             </w:pPr>
             <w:r>
               <w:rPr>
-                <w:rFonts w:ascii="Arial" w:hAnsi="Arial"/>
-                <w:color w:val="333333"/>
-                <w:sz w:val="19"/>
+                <w:rFonts w:ascii="Times New Roman" w:hAnsi="Times New Roman"/>
+                <w:color w:val="000000"/>
+                <w:sz w:val="24"/>
               </w:rPr>
-              <w:t>Yêu cầu kết nối mạng</w:t>
+              <w:t>Giao diện</w:t>
             </w:r>
           </w:p>
         </w:tc>
@@ -645,10 +402,10 @@
           <w:tcPr>
             <w:tcW w:type="dxa" w:w="3600"/>
             <w:tcMar>
-              <w:top w:w="100" w:type="dxa"/>
-              <w:bottom w:w="100" w:type="dxa"/>
-              <w:left w:w="140" w:type="dxa"/>
-              <w:right w:w="140" w:type="dxa"/>
+              <w:top w:w="80" w:type="dxa"/>
+              <w:bottom w:w="80" w:type="dxa"/>
+              <w:left w:w="120" w:type="dxa"/>
+              <w:right w:w="120" w:type="dxa"/>
             </w:tcMar>
           </w:tcPr>
           <w:p>
@@ -657,11 +414,11 @@
             </w:pPr>
             <w:r>
               <w:rPr>
-                <w:rFonts w:ascii="Arial" w:hAnsi="Arial"/>
-                <w:color w:val="333333"/>
-                <w:sz w:val="19"/>
+                <w:rFonts w:ascii="Times New Roman" w:hAnsi="Times New Roman"/>
+                <w:color w:val="000000"/>
+                <w:sz w:val="24"/>
               </w:rPr>
-              <w:t>Không cần Internet (Offline hoàn toàn)</w:t>
+              <w:t>Dòng lệnh (CLI / Terminal)</w:t>
             </w:r>
           </w:p>
         </w:tc>
@@ -669,10 +426,10 @@
           <w:tcPr>
             <w:tcW w:type="dxa" w:w="3600"/>
             <w:tcMar>
-              <w:top w:w="100" w:type="dxa"/>
-              <w:bottom w:w="100" w:type="dxa"/>
-              <w:left w:w="140" w:type="dxa"/>
-              <w:right w:w="140" w:type="dxa"/>
+              <w:top w:w="80" w:type="dxa"/>
+              <w:bottom w:w="80" w:type="dxa"/>
+              <w:left w:w="120" w:type="dxa"/>
+              <w:right w:w="120" w:type="dxa"/>
             </w:tcMar>
           </w:tcPr>
           <w:p>
@@ -681,11 +438,11 @@
             </w:pPr>
             <w:r>
               <w:rPr>
-                <w:rFonts w:ascii="Arial" w:hAnsi="Arial"/>
-                <w:color w:val="333333"/>
-                <w:sz w:val="19"/>
+                <w:rFonts w:ascii="Times New Roman" w:hAnsi="Times New Roman"/>
+                <w:color w:val="000000"/>
+                <w:sz w:val="24"/>
               </w:rPr>
-              <w:t>Bắt buộc có Internet để truy cập và đồng bộ</w:t>
+              <w:t>Giao diện Web trực quan</w:t>
             </w:r>
           </w:p>
         </w:tc>
@@ -694,12 +451,11 @@
         <w:tc>
           <w:tcPr>
             <w:tcW w:type="dxa" w:w="2160"/>
-            <w:shd w:fill="F9FAFB"/>
             <w:tcMar>
-              <w:top w:w="100" w:type="dxa"/>
-              <w:bottom w:w="100" w:type="dxa"/>
-              <w:left w:w="140" w:type="dxa"/>
-              <w:right w:w="140" w:type="dxa"/>
+              <w:top w:w="80" w:type="dxa"/>
+              <w:bottom w:w="80" w:type="dxa"/>
+              <w:left w:w="120" w:type="dxa"/>
+              <w:right w:w="120" w:type="dxa"/>
             </w:tcMar>
           </w:tcPr>
           <w:p>
@@ -709,23 +465,22 @@
             </w:pPr>
             <w:r>
               <w:rPr>
-                <w:rFonts w:ascii="Arial" w:hAnsi="Arial"/>
-                <w:color w:val="333333"/>
-                <w:sz w:val="19"/>
+                <w:rFonts w:ascii="Times New Roman" w:hAnsi="Times New Roman"/>
+                <w:color w:val="000000"/>
+                <w:sz w:val="24"/>
               </w:rPr>
-              <w:t>Phương thức thao tác</w:t>
+              <w:t>Mục tiêu</w:t>
             </w:r>
           </w:p>
         </w:tc>
         <w:tc>
           <w:tcPr>
             <w:tcW w:type="dxa" w:w="3600"/>
-            <w:shd w:fill="F9FAFB"/>
             <w:tcMar>
-              <w:top w:w="100" w:type="dxa"/>
-              <w:bottom w:w="100" w:type="dxa"/>
-              <w:left w:w="140" w:type="dxa"/>
-              <w:right w:w="140" w:type="dxa"/>
+              <w:top w:w="80" w:type="dxa"/>
+              <w:bottom w:w="80" w:type="dxa"/>
+              <w:left w:w="120" w:type="dxa"/>
+              <w:right w:w="120" w:type="dxa"/>
             </w:tcMar>
           </w:tcPr>
           <w:p>
@@ -734,23 +489,22 @@
             </w:pPr>
             <w:r>
               <w:rPr>
-                <w:rFonts w:ascii="Arial" w:hAnsi="Arial"/>
-                <w:color w:val="333333"/>
-                <w:sz w:val="19"/>
+                <w:rFonts w:ascii="Times New Roman" w:hAnsi="Times New Roman"/>
+                <w:color w:val="000000"/>
+                <w:sz w:val="24"/>
               </w:rPr>
-              <w:t>Chủ yếu dùng giao diện dòng lệnh (CLI / Terminal)</w:t>
+              <w:t>Lưu vết lịch sử thay đổi và quản lý nhánh</w:t>
             </w:r>
           </w:p>
         </w:tc>
         <w:tc>
           <w:tcPr>
             <w:tcW w:type="dxa" w:w="3600"/>
-            <w:shd w:fill="F9FAFB"/>
             <w:tcMar>
-              <w:top w:w="100" w:type="dxa"/>
-              <w:bottom w:w="100" w:type="dxa"/>
-              <w:left w:w="140" w:type="dxa"/>
-              <w:right w:w="140" w:type="dxa"/>
+              <w:top w:w="80" w:type="dxa"/>
+              <w:bottom w:w="80" w:type="dxa"/>
+              <w:left w:w="120" w:type="dxa"/>
+              <w:right w:w="120" w:type="dxa"/>
             </w:tcMar>
           </w:tcPr>
           <w:p>
@@ -759,164 +513,11 @@
             </w:pPr>
             <w:r>
               <w:rPr>
-                <w:rFonts w:ascii="Arial" w:hAnsi="Arial"/>
-                <w:color w:val="333333"/>
-                <w:sz w:val="19"/>
+                <w:rFonts w:ascii="Times New Roman" w:hAnsi="Times New Roman"/>
+                <w:color w:val="000000"/>
+                <w:sz w:val="24"/>
               </w:rPr>
-              <w:t>Giao diện web đồ họa (GUI) trực quan, hiện đại</w:t>
-            </w:r>
-          </w:p>
-        </w:tc>
-      </w:tr>
-      <w:tr>
-        <w:tc>
-          <w:tcPr>
-            <w:tcW w:type="dxa" w:w="2160"/>
-            <w:tcMar>
-              <w:top w:w="100" w:type="dxa"/>
-              <w:bottom w:w="100" w:type="dxa"/>
-              <w:left w:w="140" w:type="dxa"/>
-              <w:right w:w="140" w:type="dxa"/>
-            </w:tcMar>
-          </w:tcPr>
-          <w:p>
-            <w:pPr>
-              <w:spacing w:before="0" w:after="0" w:line="276" w:lineRule="auto"/>
-              <w:jc w:val="center"/>
-            </w:pPr>
-            <w:r>
-              <w:rPr>
-                <w:rFonts w:ascii="Arial" w:hAnsi="Arial"/>
-                <w:color w:val="333333"/>
-                <w:sz w:val="19"/>
-              </w:rPr>
-              <w:t>Chức năng chính</w:t>
-            </w:r>
-          </w:p>
-        </w:tc>
-        <w:tc>
-          <w:tcPr>
-            <w:tcW w:type="dxa" w:w="3600"/>
-            <w:tcMar>
-              <w:top w:w="100" w:type="dxa"/>
-              <w:bottom w:w="100" w:type="dxa"/>
-              <w:left w:w="140" w:type="dxa"/>
-              <w:right w:w="140" w:type="dxa"/>
-            </w:tcMar>
-          </w:tcPr>
-          <w:p>
-            <w:pPr>
-              <w:spacing w:before="0" w:after="0" w:line="276" w:lineRule="auto"/>
-            </w:pPr>
-            <w:r>
-              <w:rPr>
-                <w:rFonts w:ascii="Arial" w:hAnsi="Arial"/>
-                <w:color w:val="333333"/>
-                <w:sz w:val="19"/>
-              </w:rPr>
-              <w:t>Theo dõi thay đổi file, phân nhánh, hoàn tác phiên bản</w:t>
-            </w:r>
-          </w:p>
-        </w:tc>
-        <w:tc>
-          <w:tcPr>
-            <w:tcW w:type="dxa" w:w="3600"/>
-            <w:tcMar>
-              <w:top w:w="100" w:type="dxa"/>
-              <w:bottom w:w="100" w:type="dxa"/>
-              <w:left w:w="140" w:type="dxa"/>
-              <w:right w:w="140" w:type="dxa"/>
-            </w:tcMar>
-          </w:tcPr>
-          <w:p>
-            <w:pPr>
-              <w:spacing w:before="0" w:after="0" w:line="276" w:lineRule="auto"/>
-            </w:pPr>
-            <w:r>
-              <w:rPr>
-                <w:rFonts w:ascii="Arial" w:hAnsi="Arial"/>
-                <w:color w:val="333333"/>
-                <w:sz w:val="19"/>
-              </w:rPr>
-              <w:t>Lưu trữ tập trung, chia sẻ code, quản lý dự án, CI/CD</w:t>
-            </w:r>
-          </w:p>
-        </w:tc>
-      </w:tr>
-      <w:tr>
-        <w:tc>
-          <w:tcPr>
-            <w:tcW w:type="dxa" w:w="2160"/>
-            <w:shd w:fill="F9FAFB"/>
-            <w:tcMar>
-              <w:top w:w="100" w:type="dxa"/>
-              <w:bottom w:w="100" w:type="dxa"/>
-              <w:left w:w="140" w:type="dxa"/>
-              <w:right w:w="140" w:type="dxa"/>
-            </w:tcMar>
-          </w:tcPr>
-          <w:p>
-            <w:pPr>
-              <w:spacing w:before="0" w:after="0" w:line="276" w:lineRule="auto"/>
-              <w:jc w:val="center"/>
-            </w:pPr>
-            <w:r>
-              <w:rPr>
-                <w:rFonts w:ascii="Arial" w:hAnsi="Arial"/>
-                <w:color w:val="333333"/>
-                <w:sz w:val="19"/>
-              </w:rPr>
-              <w:t>Khả năng hoạt động độc lập</w:t>
-            </w:r>
-          </w:p>
-        </w:tc>
-        <w:tc>
-          <w:tcPr>
-            <w:tcW w:type="dxa" w:w="3600"/>
-            <w:shd w:fill="F9FAFB"/>
-            <w:tcMar>
-              <w:top w:w="100" w:type="dxa"/>
-              <w:bottom w:w="100" w:type="dxa"/>
-              <w:left w:w="140" w:type="dxa"/>
-              <w:right w:w="140" w:type="dxa"/>
-            </w:tcMar>
-          </w:tcPr>
-          <w:p>
-            <w:pPr>
-              <w:spacing w:before="0" w:after="0" w:line="276" w:lineRule="auto"/>
-            </w:pPr>
-            <w:r>
-              <w:rPr>
-                <w:rFonts w:ascii="Arial" w:hAnsi="Arial"/>
-                <w:color w:val="333333"/>
-                <w:sz w:val="19"/>
-              </w:rPr>
-              <w:t>Hoạt động độc lập mà không cần GitHub</w:t>
-            </w:r>
-          </w:p>
-        </w:tc>
-        <w:tc>
-          <w:tcPr>
-            <w:tcW w:type="dxa" w:w="3600"/>
-            <w:shd w:fill="F9FAFB"/>
-            <w:tcMar>
-              <w:top w:w="100" w:type="dxa"/>
-              <w:bottom w:w="100" w:type="dxa"/>
-              <w:left w:w="140" w:type="dxa"/>
-              <w:right w:w="140" w:type="dxa"/>
-            </w:tcMar>
-          </w:tcPr>
-          <w:p>
-            <w:pPr>
-              <w:spacing w:before="0" w:after="0" w:line="276" w:lineRule="auto"/>
-            </w:pPr>
-            <w:r>
-              <w:rPr>
-                <w:rFonts w:ascii="Arial" w:hAnsi="Arial"/>
-                <w:color w:val="333333"/>
-                <w:sz w:val="19"/>
-              </w:rPr>
-              <w:t>Phụ thuộc vào Git (dùng Git làm nền tảng cốt lõi)</w:t>
+              <w:t>Chia sẻ mã nguồn, duyệt code (PR) &amp; cộng tác nhóm</w:t>
             </w:r>
           </w:p>
         </w:tc>
@@ -924,50 +525,37 @@
     </w:tbl>
     <w:p>
       <w:pPr>
-        <w:spacing w:after="120"/>
+        <w:spacing w:after="80"/>
       </w:pPr>
     </w:p>
     <w:p>
       <w:pPr>
         <w:keepNext/>
-        <w:spacing w:before="320" w:after="120"/>
+        <w:spacing w:before="280" w:after="80"/>
       </w:pPr>
       <w:r>
         <w:rPr>
-          <w:rFonts w:ascii="Arial" w:hAnsi="Arial"/>
+          <w:rFonts w:ascii="Times New Roman" w:hAnsi="Times New Roman"/>
           <w:b/>
-          <w:color w:val="1F4E79"/>
-          <w:sz w:val="27"/>
+          <w:color w:val="000000"/>
+          <w:sz w:val="30"/>
         </w:rPr>
-        <w:t>2. CÁC CÂU LỆNH GIT THÔNG DỤNG VÀ CÔNG DỤNG CỤ THỂ</w:t>
-      </w:r>
-    </w:p>
-    <w:p>
-      <w:pPr>
-        <w:spacing w:before="0" w:after="120" w:line="288" w:lineRule="auto"/>
-      </w:pPr>
-      <w:r>
-        <w:rPr>
-          <w:rFonts w:ascii="Arial" w:hAnsi="Arial"/>
-          <w:color w:val="222222"/>
-          <w:sz w:val="21"/>
-        </w:rPr>
-        <w:t>Trong quy trình phát triển và quản trị phần mềm, các lập trình viên sử dụng Git thông qua các nhóm lệnh chức năng cụ thể sau:</w:t>
+        <w:t>2. CÁC CÂU LỆNH GIT VÀ CÔNG DỤNG CỤ THỂ</w:t>
       </w:r>
     </w:p>
     <w:p>
       <w:pPr>
         <w:keepNext/>
-        <w:spacing w:before="240" w:after="80"/>
+        <w:spacing w:before="200" w:after="60"/>
       </w:pPr>
       <w:r>
         <w:rPr>
-          <w:rFonts w:ascii="Arial" w:hAnsi="Arial"/>
+          <w:rFonts w:ascii="Times New Roman" w:hAnsi="Times New Roman"/>
           <w:b/>
-          <w:color w:val="2E75B6"/>
-          <w:sz w:val="23"/>
+          <w:color w:val="000000"/>
+          <w:sz w:val="27"/>
         </w:rPr>
-        <w:t>2.1. Nhóm Khởi tạo &amp; Thiết lập Cấu hình</w:t>
+        <w:t>2.1. Cấu hình &amp; Khởi tạo</w:t>
       </w:r>
     </w:p>
     <w:p>
@@ -977,19 +565,20 @@
       </w:pPr>
       <w:r>
         <w:rPr>
-          <w:rFonts w:ascii="Arial" w:hAnsi="Arial"/>
+          <w:rFonts w:ascii="Times New Roman" w:hAnsi="Times New Roman"/>
           <w:b/>
-          <w:sz w:val="21"/>
+          <w:color w:val="000000"/>
+          <w:sz w:val="26"/>
         </w:rPr>
-        <w:t xml:space="preserve">git config --global user.name "Tên Của Bạn": </w:t>
+        <w:t xml:space="preserve">git config --global user.name / user.email: </w:t>
       </w:r>
       <w:r>
         <w:rPr>
-          <w:rFonts w:ascii="Arial" w:hAnsi="Arial"/>
-          <w:color w:val="222222"/>
-          <w:sz w:val="21"/>
+          <w:rFonts w:ascii="Times New Roman" w:hAnsi="Times New Roman"/>
+          <w:color w:val="000000"/>
+          <w:sz w:val="26"/>
         </w:rPr>
-        <w:t>Dùng để cấu hình tên tác giả xuất hiện trên tất cả các commit mà bạn thực hiện.</w:t>
+        <w:t>Cài đặt tên và email của bạn để gắn vào các commit.</w:t>
       </w:r>
     </w:p>
     <w:p>
@@ -999,19 +588,20 @@
       </w:pPr>
       <w:r>
         <w:rPr>
-          <w:rFonts w:ascii="Arial" w:hAnsi="Arial"/>
+          <w:rFonts w:ascii="Times New Roman" w:hAnsi="Times New Roman"/>
           <w:b/>
-          <w:sz w:val="21"/>
+          <w:color w:val="000000"/>
+          <w:sz w:val="26"/>
         </w:rPr>
-        <w:t xml:space="preserve">git config --global user.email "email@gmail.com": </w:t>
+        <w:t xml:space="preserve">git init: </w:t>
       </w:r>
       <w:r>
         <w:rPr>
-          <w:rFonts w:ascii="Arial" w:hAnsi="Arial"/>
-          <w:color w:val="222222"/>
-          <w:sz w:val="21"/>
+          <w:rFonts w:ascii="Times New Roman" w:hAnsi="Times New Roman"/>
+          <w:color w:val="000000"/>
+          <w:sz w:val="26"/>
         </w:rPr>
-        <w:t>Dùng để thiết lập địa chỉ email gắn liền với commit. Email này cần khớp với email trên GitHub để được tính điểm đóng góp (contributions).</w:t>
+        <w:t>Khởi tạo một kho lưu trữ Git mới trong thư mục hiện tại.</w:t>
       </w:r>
     </w:p>
     <w:p>
@@ -1021,19 +611,35 @@
       </w:pPr>
       <w:r>
         <w:rPr>
-          <w:rFonts w:ascii="Arial" w:hAnsi="Arial"/>
+          <w:rFonts w:ascii="Times New Roman" w:hAnsi="Times New Roman"/>
           <w:b/>
-          <w:sz w:val="21"/>
+          <w:color w:val="000000"/>
+          <w:sz w:val="26"/>
         </w:rPr>
-        <w:t xml:space="preserve">git config --list: </w:t>
+        <w:t xml:space="preserve">git clone &lt;url&gt;: </w:t>
       </w:r>
       <w:r>
         <w:rPr>
-          <w:rFonts w:ascii="Arial" w:hAnsi="Arial"/>
-          <w:color w:val="222222"/>
-          <w:sz w:val="21"/>
+          <w:rFonts w:ascii="Times New Roman" w:hAnsi="Times New Roman"/>
+          <w:color w:val="000000"/>
+          <w:sz w:val="26"/>
         </w:rPr>
-        <w:t>Dùng để kiểm tra lại toàn bộ các thông số cấu hình Git hiện tại trên máy tính.</w:t>
+        <w:t>Tải toàn bộ dự án từ GitHub về máy tính cá nhân.</w:t>
+      </w:r>
+    </w:p>
+    <w:p>
+      <w:pPr>
+        <w:keepNext/>
+        <w:spacing w:before="200" w:after="60"/>
+      </w:pPr>
+      <w:r>
+        <w:rPr>
+          <w:rFonts w:ascii="Times New Roman" w:hAnsi="Times New Roman"/>
+          <w:b/>
+          <w:color w:val="000000"/>
+          <w:sz w:val="27"/>
+        </w:rPr>
+        <w:t>2.2. Kiểm tra trạng thái &amp; Staging</w:t>
       </w:r>
     </w:p>
     <w:p>
@@ -1043,19 +649,20 @@
       </w:pPr>
       <w:r>
         <w:rPr>
-          <w:rFonts w:ascii="Arial" w:hAnsi="Arial"/>
+          <w:rFonts w:ascii="Times New Roman" w:hAnsi="Times New Roman"/>
           <w:b/>
-          <w:sz w:val="21"/>
+          <w:color w:val="000000"/>
+          <w:sz w:val="26"/>
         </w:rPr>
-        <w:t xml:space="preserve">git init: </w:t>
+        <w:t xml:space="preserve">git status: </w:t>
       </w:r>
       <w:r>
         <w:rPr>
-          <w:rFonts w:ascii="Arial" w:hAnsi="Arial"/>
-          <w:color w:val="222222"/>
-          <w:sz w:val="21"/>
+          <w:rFonts w:ascii="Times New Roman" w:hAnsi="Times New Roman"/>
+          <w:color w:val="000000"/>
+          <w:sz w:val="26"/>
         </w:rPr>
-        <w:t>Dùng để biến một thư mục thông thường thành một Git Repository. Lệnh tạo ra thư mục ẩn .git chứa toàn bộ cơ sở dữ liệu của Git.</w:t>
+        <w:t>Xem trạng thái các file (file mới tạo, file bị sửa, file đã sẵn sàng lưu).</w:t>
       </w:r>
     </w:p>
     <w:p>
@@ -1065,34 +672,20 @@
       </w:pPr>
       <w:r>
         <w:rPr>
-          <w:rFonts w:ascii="Arial" w:hAnsi="Arial"/>
+          <w:rFonts w:ascii="Times New Roman" w:hAnsi="Times New Roman"/>
           <w:b/>
-          <w:sz w:val="21"/>
+          <w:color w:val="000000"/>
+          <w:sz w:val="26"/>
         </w:rPr>
-        <w:t xml:space="preserve">git clone &lt;url&gt;: </w:t>
+        <w:t xml:space="preserve">git add &lt;tên_file&gt;: </w:t>
       </w:r>
       <w:r>
         <w:rPr>
-          <w:rFonts w:ascii="Arial" w:hAnsi="Arial"/>
-          <w:color w:val="222222"/>
-          <w:sz w:val="21"/>
+          <w:rFonts w:ascii="Times New Roman" w:hAnsi="Times New Roman"/>
+          <w:color w:val="000000"/>
+          <w:sz w:val="26"/>
         </w:rPr>
-        <w:t>Dùng để tải (clone) toàn bộ mã nguồn và lịch sử của một dự án từ GitHub (hoặc URL máy chủ) về máy tính cục bộ.</w:t>
-      </w:r>
-    </w:p>
-    <w:p>
-      <w:pPr>
-        <w:keepNext/>
-        <w:spacing w:before="240" w:after="80"/>
-      </w:pPr>
-      <w:r>
-        <w:rPr>
-          <w:rFonts w:ascii="Arial" w:hAnsi="Arial"/>
-          <w:b/>
-          <w:color w:val="2E75B6"/>
-          <w:sz w:val="23"/>
-        </w:rPr>
-        <w:t>2.2. Nhóm Kiểm tra Trạng thái &amp; Quản lý Staging Area</w:t>
+        <w:t>Đưa 1 file cụ thể vào khu vực chuẩn bị commit (Staging Area).</w:t>
       </w:r>
     </w:p>
     <w:p>
@@ -1102,19 +695,20 @@
       </w:pPr>
       <w:r>
         <w:rPr>
-          <w:rFonts w:ascii="Arial" w:hAnsi="Arial"/>
+          <w:rFonts w:ascii="Times New Roman" w:hAnsi="Times New Roman"/>
           <w:b/>
-          <w:sz w:val="21"/>
+          <w:color w:val="000000"/>
+          <w:sz w:val="26"/>
         </w:rPr>
-        <w:t xml:space="preserve">git status: </w:t>
+        <w:t xml:space="preserve">git add .: </w:t>
       </w:r>
       <w:r>
         <w:rPr>
-          <w:rFonts w:ascii="Arial" w:hAnsi="Arial"/>
-          <w:color w:val="222222"/>
-          <w:sz w:val="21"/>
+          <w:rFonts w:ascii="Times New Roman" w:hAnsi="Times New Roman"/>
+          <w:color w:val="000000"/>
+          <w:sz w:val="26"/>
         </w:rPr>
-        <w:t>Dùng để xem trạng thái hiện tại của dự án: file nào mới tạo chưa theo dõi (Untracked), file nào đã sửa đổi (Modified), file nào đã được đưa vào Staging.</w:t>
+        <w:t>Đưa toàn bộ tất cả file mới và file sửa đổi vào Staging Area.</w:t>
       </w:r>
     </w:p>
     <w:p>
@@ -1124,19 +718,35 @@
       </w:pPr>
       <w:r>
         <w:rPr>
-          <w:rFonts w:ascii="Arial" w:hAnsi="Arial"/>
+          <w:rFonts w:ascii="Times New Roman" w:hAnsi="Times New Roman"/>
           <w:b/>
-          <w:sz w:val="21"/>
+          <w:color w:val="000000"/>
+          <w:sz w:val="26"/>
         </w:rPr>
-        <w:t xml:space="preserve">git add &lt;tên_file&gt;: </w:t>
+        <w:t xml:space="preserve">git diff: </w:t>
       </w:r>
       <w:r>
         <w:rPr>
-          <w:rFonts w:ascii="Arial" w:hAnsi="Arial"/>
-          <w:color w:val="222222"/>
-          <w:sz w:val="21"/>
+          <w:rFonts w:ascii="Times New Roman" w:hAnsi="Times New Roman"/>
+          <w:color w:val="000000"/>
+          <w:sz w:val="26"/>
         </w:rPr>
-        <w:t>Dùng để đưa một file cụ thể vào khu vực Staging Area, đánh dấu chuẩn bị được lưu trong commit kế tiếp.</w:t>
+        <w:t>Xem chi tiết những dòng mã vừa thay đổi so với bản lưu trước đó.</w:t>
+      </w:r>
+    </w:p>
+    <w:p>
+      <w:pPr>
+        <w:keepNext/>
+        <w:spacing w:before="200" w:after="60"/>
+      </w:pPr>
+      <w:r>
+        <w:rPr>
+          <w:rFonts w:ascii="Times New Roman" w:hAnsi="Times New Roman"/>
+          <w:b/>
+          <w:color w:val="000000"/>
+          <w:sz w:val="27"/>
+        </w:rPr>
+        <w:t>2.3. Lưu trữ phiên bản &amp; Xem lịch sử</w:t>
       </w:r>
     </w:p>
     <w:p>
@@ -1146,19 +756,20 @@
       </w:pPr>
       <w:r>
         <w:rPr>
-          <w:rFonts w:ascii="Arial" w:hAnsi="Arial"/>
+          <w:rFonts w:ascii="Times New Roman" w:hAnsi="Times New Roman"/>
           <w:b/>
-          <w:sz w:val="21"/>
+          <w:color w:val="000000"/>
+          <w:sz w:val="26"/>
         </w:rPr>
-        <w:t xml:space="preserve">git add . (hoặc git add -A): </w:t>
+        <w:t xml:space="preserve">git commit -m "mô_tả": </w:t>
       </w:r>
       <w:r>
         <w:rPr>
-          <w:rFonts w:ascii="Arial" w:hAnsi="Arial"/>
-          <w:color w:val="222222"/>
-          <w:sz w:val="21"/>
+          <w:rFonts w:ascii="Times New Roman" w:hAnsi="Times New Roman"/>
+          <w:color w:val="000000"/>
+          <w:sz w:val="26"/>
         </w:rPr>
-        <w:t>Dùng để thêm TẤT CẢ các file mới tạo hoặc vừa sửa đổi vào Staging Area chỉ bằng một thao tác.</w:t>
+        <w:t>Lưu lại cột mốc thay đổi kèm tin nhắn mô tả nội dung đã làm.</w:t>
       </w:r>
     </w:p>
     <w:p>
@@ -1168,19 +779,20 @@
       </w:pPr>
       <w:r>
         <w:rPr>
-          <w:rFonts w:ascii="Arial" w:hAnsi="Arial"/>
+          <w:rFonts w:ascii="Times New Roman" w:hAnsi="Times New Roman"/>
           <w:b/>
-          <w:sz w:val="21"/>
+          <w:color w:val="000000"/>
+          <w:sz w:val="26"/>
         </w:rPr>
-        <w:t xml:space="preserve">git diff: </w:t>
+        <w:t xml:space="preserve">git log: </w:t>
       </w:r>
       <w:r>
         <w:rPr>
-          <w:rFonts w:ascii="Arial" w:hAnsi="Arial"/>
-          <w:color w:val="222222"/>
-          <w:sz w:val="21"/>
+          <w:rFonts w:ascii="Times New Roman" w:hAnsi="Times New Roman"/>
+          <w:color w:val="000000"/>
+          <w:sz w:val="26"/>
         </w:rPr>
-        <w:t>Dùng để so sánh sự khác biệt chi tiết từng dòng mã giữa thư mục làm việc và bản commit gần nhất.</w:t>
+        <w:t>Xem danh sách các lần commit trước đó trong dự án.</w:t>
       </w:r>
     </w:p>
     <w:p>
@@ -1190,34 +802,35 @@
       </w:pPr>
       <w:r>
         <w:rPr>
-          <w:rFonts w:ascii="Arial" w:hAnsi="Arial"/>
+          <w:rFonts w:ascii="Times New Roman" w:hAnsi="Times New Roman"/>
           <w:b/>
-          <w:sz w:val="21"/>
+          <w:color w:val="000000"/>
+          <w:sz w:val="26"/>
         </w:rPr>
-        <w:t xml:space="preserve">git diff --staged: </w:t>
+        <w:t xml:space="preserve">git log --oneline --graph: </w:t>
       </w:r>
       <w:r>
         <w:rPr>
-          <w:rFonts w:ascii="Arial" w:hAnsi="Arial"/>
-          <w:color w:val="222222"/>
-          <w:sz w:val="21"/>
+          <w:rFonts w:ascii="Times New Roman" w:hAnsi="Times New Roman"/>
+          <w:color w:val="000000"/>
+          <w:sz w:val="26"/>
         </w:rPr>
-        <w:t>Dùng để xem chi tiết các thay đổi của những file ĐÃ NẰM TRONG Staging Area so với commit gần nhất.</w:t>
+        <w:t>Xem lịch sử commit rút gọn trên 1 dòng kèm sơ đồ phân nhánh.</w:t>
       </w:r>
     </w:p>
     <w:p>
       <w:pPr>
         <w:keepNext/>
-        <w:spacing w:before="240" w:after="80"/>
+        <w:spacing w:before="200" w:after="60"/>
       </w:pPr>
       <w:r>
         <w:rPr>
-          <w:rFonts w:ascii="Arial" w:hAnsi="Arial"/>
+          <w:rFonts w:ascii="Times New Roman" w:hAnsi="Times New Roman"/>
           <w:b/>
-          <w:color w:val="2E75B6"/>
-          <w:sz w:val="23"/>
+          <w:color w:val="000000"/>
+          <w:sz w:val="27"/>
         </w:rPr>
-        <w:t>2.3. Nhóm Ghi nhận Phiên bản (Commit) &amp; Lịch sử Thay đổi</w:t>
+        <w:t>2.4. Phân nhánh (Branching) &amp; Gộp nhánh (Merging)</w:t>
       </w:r>
     </w:p>
     <w:p>
@@ -1227,19 +840,20 @@
       </w:pPr>
       <w:r>
         <w:rPr>
-          <w:rFonts w:ascii="Arial" w:hAnsi="Arial"/>
+          <w:rFonts w:ascii="Times New Roman" w:hAnsi="Times New Roman"/>
           <w:b/>
-          <w:sz w:val="21"/>
+          <w:color w:val="000000"/>
+          <w:sz w:val="26"/>
         </w:rPr>
-        <w:t xml:space="preserve">git commit -m "nội dung mô tả": </w:t>
+        <w:t xml:space="preserve">git branch: </w:t>
       </w:r>
       <w:r>
         <w:rPr>
-          <w:rFonts w:ascii="Arial" w:hAnsi="Arial"/>
-          <w:color w:val="222222"/>
-          <w:sz w:val="21"/>
+          <w:rFonts w:ascii="Times New Roman" w:hAnsi="Times New Roman"/>
+          <w:color w:val="000000"/>
+          <w:sz w:val="26"/>
         </w:rPr>
-        <w:t>Dùng để lưu lại ảnh chụp trạng thái (snapshot) vĩnh viễn của các file trong Staging Area kèm thông điệp mô tả nội dung đã thay đổi.</w:t>
+        <w:t>Liệt kê danh sách các nhánh trong máy.</w:t>
       </w:r>
     </w:p>
     <w:p>
@@ -1249,19 +863,20 @@
       </w:pPr>
       <w:r>
         <w:rPr>
-          <w:rFonts w:ascii="Arial" w:hAnsi="Arial"/>
+          <w:rFonts w:ascii="Times New Roman" w:hAnsi="Times New Roman"/>
           <w:b/>
-          <w:sz w:val="21"/>
+          <w:color w:val="000000"/>
+          <w:sz w:val="26"/>
         </w:rPr>
-        <w:t xml:space="preserve">git commit -am "thông điệp": </w:t>
+        <w:t xml:space="preserve">git branch &lt;tên_nhánh&gt;: </w:t>
       </w:r>
       <w:r>
         <w:rPr>
-          <w:rFonts w:ascii="Arial" w:hAnsi="Arial"/>
-          <w:color w:val="222222"/>
-          <w:sz w:val="21"/>
+          <w:rFonts w:ascii="Times New Roman" w:hAnsi="Times New Roman"/>
+          <w:color w:val="000000"/>
+          <w:sz w:val="26"/>
         </w:rPr>
-        <w:t>Dùng để gộp 2 bước: tự động add các file đã theo dõi bị sửa và commit luôn mà không cần gõ git add trước.</w:t>
+        <w:t>Tạo một nhánh mới để phát triển tính năng riêng biệt.</w:t>
       </w:r>
     </w:p>
     <w:p>
@@ -1271,19 +886,20 @@
       </w:pPr>
       <w:r>
         <w:rPr>
-          <w:rFonts w:ascii="Arial" w:hAnsi="Arial"/>
+          <w:rFonts w:ascii="Times New Roman" w:hAnsi="Times New Roman"/>
           <w:b/>
-          <w:sz w:val="21"/>
+          <w:color w:val="000000"/>
+          <w:sz w:val="26"/>
         </w:rPr>
-        <w:t xml:space="preserve">git commit --amend: </w:t>
+        <w:t xml:space="preserve">git checkout &lt;tên_nhánh&gt; (hoặc git switch &lt;tên_nhánh&gt;): </w:t>
       </w:r>
       <w:r>
         <w:rPr>
-          <w:rFonts w:ascii="Arial" w:hAnsi="Arial"/>
-          <w:color w:val="222222"/>
-          <w:sz w:val="21"/>
+          <w:rFonts w:ascii="Times New Roman" w:hAnsi="Times New Roman"/>
+          <w:color w:val="000000"/>
+          <w:sz w:val="26"/>
         </w:rPr>
-        <w:t>Dùng để sửa lại commit gần nhất (sửa nội dung thông điệp hoặc thêm các file còn thiếu vào commit vừa tạo).</w:t>
+        <w:t>Chuyển sang làm việc trên nhánh chỉ định.</w:t>
       </w:r>
     </w:p>
     <w:p>
@@ -1293,19 +909,20 @@
       </w:pPr>
       <w:r>
         <w:rPr>
-          <w:rFonts w:ascii="Arial" w:hAnsi="Arial"/>
+          <w:rFonts w:ascii="Times New Roman" w:hAnsi="Times New Roman"/>
           <w:b/>
-          <w:sz w:val="21"/>
+          <w:color w:val="000000"/>
+          <w:sz w:val="26"/>
         </w:rPr>
-        <w:t xml:space="preserve">git log: </w:t>
+        <w:t xml:space="preserve">git checkout -b &lt;tên_nhánh&gt;: </w:t>
       </w:r>
       <w:r>
         <w:rPr>
-          <w:rFonts w:ascii="Arial" w:hAnsi="Arial"/>
-          <w:color w:val="222222"/>
-          <w:sz w:val="21"/>
+          <w:rFonts w:ascii="Times New Roman" w:hAnsi="Times New Roman"/>
+          <w:color w:val="000000"/>
+          <w:sz w:val="26"/>
         </w:rPr>
-        <w:t>Dùng để xem toàn bộ danh sách các commit trước đó (tác giả, ngày giờ, mã hash SHA-1, nội dung mô tả).</w:t>
+        <w:t>Tạo nhanh nhánh mới và chuyển ngay sang nhánh đó.</w:t>
       </w:r>
     </w:p>
     <w:p>
@@ -1315,19 +932,35 @@
       </w:pPr>
       <w:r>
         <w:rPr>
-          <w:rFonts w:ascii="Arial" w:hAnsi="Arial"/>
+          <w:rFonts w:ascii="Times New Roman" w:hAnsi="Times New Roman"/>
           <w:b/>
-          <w:sz w:val="21"/>
+          <w:color w:val="000000"/>
+          <w:sz w:val="26"/>
         </w:rPr>
-        <w:t xml:space="preserve">git log --oneline --graph: </w:t>
+        <w:t xml:space="preserve">git merge &lt;tên_nhánh&gt;: </w:t>
       </w:r>
       <w:r>
         <w:rPr>
-          <w:rFonts w:ascii="Arial" w:hAnsi="Arial"/>
-          <w:color w:val="222222"/>
-          <w:sz w:val="21"/>
+          <w:rFonts w:ascii="Times New Roman" w:hAnsi="Times New Roman"/>
+          <w:color w:val="000000"/>
+          <w:sz w:val="26"/>
         </w:rPr>
-        <w:t>Dùng để hiển thị lịch sử commit vắn tắt trên 1 dòng kèm sơ đồ nhánh trực quan, rất hữu ích khi quản lý dự án lớn.</w:t>
+        <w:t>Gộp mã nguồn từ một nhánh khác vào nhánh hiện tại.</w:t>
+      </w:r>
+    </w:p>
+    <w:p>
+      <w:pPr>
+        <w:keepNext/>
+        <w:spacing w:before="200" w:after="60"/>
+      </w:pPr>
+      <w:r>
+        <w:rPr>
+          <w:rFonts w:ascii="Times New Roman" w:hAnsi="Times New Roman"/>
+          <w:b/>
+          <w:color w:val="000000"/>
+          <w:sz w:val="27"/>
+        </w:rPr>
+        <w:t>2.5. Làm việc với GitHub (Remote)</w:t>
       </w:r>
     </w:p>
     <w:p>
@@ -1337,34 +970,20 @@
       </w:pPr>
       <w:r>
         <w:rPr>
-          <w:rFonts w:ascii="Arial" w:hAnsi="Arial"/>
+          <w:rFonts w:ascii="Times New Roman" w:hAnsi="Times New Roman"/>
           <w:b/>
-          <w:sz w:val="21"/>
+          <w:color w:val="000000"/>
+          <w:sz w:val="26"/>
         </w:rPr>
-        <w:t xml:space="preserve">git show &lt;commit_id&gt;: </w:t>
+        <w:t xml:space="preserve">git remote add origin &lt;url&gt;: </w:t>
       </w:r>
       <w:r>
         <w:rPr>
-          <w:rFonts w:ascii="Arial" w:hAnsi="Arial"/>
-          <w:color w:val="222222"/>
-          <w:sz w:val="21"/>
+          <w:rFonts w:ascii="Times New Roman" w:hAnsi="Times New Roman"/>
+          <w:color w:val="000000"/>
+          <w:sz w:val="26"/>
         </w:rPr>
-        <w:t>Dùng để xem chi tiết nội dung thay đổi của một commit cụ thể thông qua mã định danh hash.</w:t>
-      </w:r>
-    </w:p>
-    <w:p>
-      <w:pPr>
-        <w:keepNext/>
-        <w:spacing w:before="240" w:after="80"/>
-      </w:pPr>
-      <w:r>
-        <w:rPr>
-          <w:rFonts w:ascii="Arial" w:hAnsi="Arial"/>
-          <w:b/>
-          <w:color w:val="2E75B6"/>
-          <w:sz w:val="23"/>
-        </w:rPr>
-        <w:t>2.4. Nhóm Phân nhánh (Branching) &amp; Hợp nhất (Merging)</w:t>
+        <w:t>Liên kết kho Git dưới máy tính với repository trên GitHub.</w:t>
       </w:r>
     </w:p>
     <w:p>
@@ -1374,19 +993,20 @@
       </w:pPr>
       <w:r>
         <w:rPr>
-          <w:rFonts w:ascii="Arial" w:hAnsi="Arial"/>
+          <w:rFonts w:ascii="Times New Roman" w:hAnsi="Times New Roman"/>
           <w:b/>
-          <w:sz w:val="21"/>
+          <w:color w:val="000000"/>
+          <w:sz w:val="26"/>
         </w:rPr>
-        <w:t xml:space="preserve">git branch: </w:t>
+        <w:t xml:space="preserve">git push -u origin &lt;nhánh&gt;: </w:t>
       </w:r>
       <w:r>
         <w:rPr>
-          <w:rFonts w:ascii="Arial" w:hAnsi="Arial"/>
-          <w:color w:val="222222"/>
-          <w:sz w:val="21"/>
+          <w:rFonts w:ascii="Times New Roman" w:hAnsi="Times New Roman"/>
+          <w:color w:val="000000"/>
+          <w:sz w:val="26"/>
         </w:rPr>
-        <w:t>Dùng để liệt kê tất cả các nhánh hiện có trong kho cục bộ. Nhánh có dấu hoa thị (*) màu xanh là nhánh đang làm việc.</w:t>
+        <w:t>Đẩy các commit từ máy tính lên kho lưu trữ GitHub.</w:t>
       </w:r>
     </w:p>
     <w:p>
@@ -1396,19 +1016,20 @@
       </w:pPr>
       <w:r>
         <w:rPr>
-          <w:rFonts w:ascii="Arial" w:hAnsi="Arial"/>
+          <w:rFonts w:ascii="Times New Roman" w:hAnsi="Times New Roman"/>
           <w:b/>
-          <w:sz w:val="21"/>
+          <w:color w:val="000000"/>
+          <w:sz w:val="26"/>
         </w:rPr>
-        <w:t xml:space="preserve">git branch &lt;tên_nhánh&gt;: </w:t>
+        <w:t xml:space="preserve">git pull: </w:t>
       </w:r>
       <w:r>
         <w:rPr>
-          <w:rFonts w:ascii="Arial" w:hAnsi="Arial"/>
-          <w:color w:val="222222"/>
-          <w:sz w:val="21"/>
+          <w:rFonts w:ascii="Times New Roman" w:hAnsi="Times New Roman"/>
+          <w:color w:val="000000"/>
+          <w:sz w:val="26"/>
         </w:rPr>
-        <w:t>Dùng để tạo một nhánh mới từ nhánh hiện tại để lập trình tính năng mới mà không sợ ảnh hưởng đến code gốc.</w:t>
+        <w:t>Tải mã nguồn mới nhất từ GitHub về và tự động gộp vào máy.</w:t>
       </w:r>
     </w:p>
     <w:p>
@@ -1418,19 +1039,35 @@
       </w:pPr>
       <w:r>
         <w:rPr>
-          <w:rFonts w:ascii="Arial" w:hAnsi="Arial"/>
+          <w:rFonts w:ascii="Times New Roman" w:hAnsi="Times New Roman"/>
           <w:b/>
-          <w:sz w:val="21"/>
+          <w:color w:val="000000"/>
+          <w:sz w:val="26"/>
         </w:rPr>
-        <w:t xml:space="preserve">git checkout &lt;tên_nhánh&gt; (hoặc git switch &lt;tên_nhánh&gt;): </w:t>
+        <w:t xml:space="preserve">git fetch: </w:t>
       </w:r>
       <w:r>
         <w:rPr>
-          <w:rFonts w:ascii="Arial" w:hAnsi="Arial"/>
-          <w:color w:val="222222"/>
-          <w:sz w:val="21"/>
+          <w:rFonts w:ascii="Times New Roman" w:hAnsi="Times New Roman"/>
+          <w:color w:val="000000"/>
+          <w:sz w:val="26"/>
         </w:rPr>
-        <w:t>Dùng để chuyển con trỏ làm việc sang một nhánh khác.</w:t>
+        <w:t>Tải thông tin nhánh và commit mới từ GitHub về nhưng chưa gộp vào code.</w:t>
+      </w:r>
+    </w:p>
+    <w:p>
+      <w:pPr>
+        <w:keepNext/>
+        <w:spacing w:before="200" w:after="60"/>
+      </w:pPr>
+      <w:r>
+        <w:rPr>
+          <w:rFonts w:ascii="Times New Roman" w:hAnsi="Times New Roman"/>
+          <w:b/>
+          <w:color w:val="000000"/>
+          <w:sz w:val="27"/>
+        </w:rPr>
+        <w:t>2.6. Hoàn tác &amp; Lưu tạm thời</w:t>
       </w:r>
     </w:p>
     <w:p>
@@ -1440,19 +1077,20 @@
       </w:pPr>
       <w:r>
         <w:rPr>
-          <w:rFonts w:ascii="Arial" w:hAnsi="Arial"/>
+          <w:rFonts w:ascii="Times New Roman" w:hAnsi="Times New Roman"/>
           <w:b/>
-          <w:sz w:val="21"/>
+          <w:color w:val="000000"/>
+          <w:sz w:val="26"/>
         </w:rPr>
-        <w:t xml:space="preserve">git checkout -b &lt;tên_nhánh&gt; (hoặc git switch -c &lt;tên_nhánh&gt;): </w:t>
+        <w:t xml:space="preserve">git restore &lt;file&gt;: </w:t>
       </w:r>
       <w:r>
         <w:rPr>
-          <w:rFonts w:ascii="Arial" w:hAnsi="Arial"/>
-          <w:color w:val="222222"/>
-          <w:sz w:val="21"/>
+          <w:rFonts w:ascii="Times New Roman" w:hAnsi="Times New Roman"/>
+          <w:color w:val="000000"/>
+          <w:sz w:val="26"/>
         </w:rPr>
-        <w:t>Dùng để vừa tạo một nhánh mới vừa chuyển ngay sang nhánh đó chỉ với một lệnh duy nhất.</w:t>
+        <w:t>Hủy bỏ các sửa đổi chưa lưu của một file, đưa về bản commit gần nhất.</w:t>
       </w:r>
     </w:p>
     <w:p>
@@ -1462,19 +1100,20 @@
       </w:pPr>
       <w:r>
         <w:rPr>
-          <w:rFonts w:ascii="Arial" w:hAnsi="Arial"/>
+          <w:rFonts w:ascii="Times New Roman" w:hAnsi="Times New Roman"/>
           <w:b/>
-          <w:sz w:val="21"/>
+          <w:color w:val="000000"/>
+          <w:sz w:val="26"/>
         </w:rPr>
-        <w:t xml:space="preserve">git merge &lt;tên_nhánh&gt;: </w:t>
+        <w:t xml:space="preserve">git restore --staged &lt;file&gt;: </w:t>
       </w:r>
       <w:r>
         <w:rPr>
-          <w:rFonts w:ascii="Arial" w:hAnsi="Arial"/>
-          <w:color w:val="222222"/>
-          <w:sz w:val="21"/>
+          <w:rFonts w:ascii="Times New Roman" w:hAnsi="Times New Roman"/>
+          <w:color w:val="000000"/>
+          <w:sz w:val="26"/>
         </w:rPr>
-        <w:t>Dùng để hòa nhập (gộp) mã nguồn và lịch sử từ một nhánh khác vào nhánh mà bạn đang đứng hiện tại.</w:t>
+        <w:t>Đưa file ra khỏi Staging Area trở lại trạng thái chưa chuẩn bị lưu.</w:t>
       </w:r>
     </w:p>
     <w:p>
@@ -1484,34 +1123,20 @@
       </w:pPr>
       <w:r>
         <w:rPr>
-          <w:rFonts w:ascii="Arial" w:hAnsi="Arial"/>
+          <w:rFonts w:ascii="Times New Roman" w:hAnsi="Times New Roman"/>
           <w:b/>
-          <w:sz w:val="21"/>
+          <w:color w:val="000000"/>
+          <w:sz w:val="26"/>
         </w:rPr>
-        <w:t xml:space="preserve">git branch -d &lt;tên_nhánh&gt;: </w:t>
+        <w:t xml:space="preserve">git reset: </w:t>
       </w:r>
       <w:r>
         <w:rPr>
-          <w:rFonts w:ascii="Arial" w:hAnsi="Arial"/>
-          <w:color w:val="222222"/>
-          <w:sz w:val="21"/>
+          <w:rFonts w:ascii="Times New Roman" w:hAnsi="Times New Roman"/>
+          <w:color w:val="000000"/>
+          <w:sz w:val="26"/>
         </w:rPr>
-        <w:t>Dùng để xóa một nhánh cục bộ sau khi đã gộp xong để giữ cho kho lưu trữ gọn gàng (dùng -D nếu muốn ép buộc xóa).</w:t>
-      </w:r>
-    </w:p>
-    <w:p>
-      <w:pPr>
-        <w:keepNext/>
-        <w:spacing w:before="240" w:after="80"/>
-      </w:pPr>
-      <w:r>
-        <w:rPr>
-          <w:rFonts w:ascii="Arial" w:hAnsi="Arial"/>
-          <w:b/>
-          <w:color w:val="2E75B6"/>
-          <w:sz w:val="23"/>
-        </w:rPr>
-        <w:t>2.5. Nhóm Đồng bộ &amp; Tương tác với Kho Lưu trữ Từ xa (GitHub)</w:t>
+        <w:t>Quay lại commit cũ (dùng --hard sẽ xóa sạch mọi thay đổi sau đó).</w:t>
       </w:r>
     </w:p>
     <w:p>
@@ -1521,19 +1146,20 @@
       </w:pPr>
       <w:r>
         <w:rPr>
-          <w:rFonts w:ascii="Arial" w:hAnsi="Arial"/>
+          <w:rFonts w:ascii="Times New Roman" w:hAnsi="Times New Roman"/>
           <w:b/>
-          <w:sz w:val="21"/>
+          <w:color w:val="000000"/>
+          <w:sz w:val="26"/>
         </w:rPr>
-        <w:t xml:space="preserve">git remote add origin &lt;url&gt;: </w:t>
+        <w:t xml:space="preserve">git revert &lt;commit_id&gt;: </w:t>
       </w:r>
       <w:r>
         <w:rPr>
-          <w:rFonts w:ascii="Arial" w:hAnsi="Arial"/>
-          <w:color w:val="222222"/>
-          <w:sz w:val="21"/>
+          <w:rFonts w:ascii="Times New Roman" w:hAnsi="Times New Roman"/>
+          <w:color w:val="000000"/>
+          <w:sz w:val="26"/>
         </w:rPr>
-        <w:t>Dùng để liên kết thư mục Git trên máy tính với một repository rỗng trên GitHub (thường đặt tên alias là origin).</w:t>
+        <w:t>Tạo commit mới để hủy bỏ một commit sai trước đó một cách an toàn.</w:t>
       </w:r>
     </w:p>
     <w:p>
@@ -1543,19 +1169,20 @@
       </w:pPr>
       <w:r>
         <w:rPr>
-          <w:rFonts w:ascii="Arial" w:hAnsi="Arial"/>
+          <w:rFonts w:ascii="Times New Roman" w:hAnsi="Times New Roman"/>
           <w:b/>
-          <w:sz w:val="21"/>
+          <w:color w:val="000000"/>
+          <w:sz w:val="26"/>
         </w:rPr>
-        <w:t xml:space="preserve">git remote -v: </w:t>
+        <w:t xml:space="preserve">git stash: </w:t>
       </w:r>
       <w:r>
         <w:rPr>
-          <w:rFonts w:ascii="Arial" w:hAnsi="Arial"/>
-          <w:color w:val="222222"/>
-          <w:sz w:val="21"/>
+          <w:rFonts w:ascii="Times New Roman" w:hAnsi="Times New Roman"/>
+          <w:color w:val="000000"/>
+          <w:sz w:val="26"/>
         </w:rPr>
-        <w:t>Dùng để kiểm tra xem máy tính của bạn đang kết nối với những Remote Repository nào trên GitHub.</w:t>
+        <w:t>Cất tạm thời các đoạn code đang làm dở khi cần đổi nhánh gấp.</w:t>
       </w:r>
     </w:p>
     <w:p>
@@ -1565,335 +1192,35 @@
       </w:pPr>
       <w:r>
         <w:rPr>
-          <w:rFonts w:ascii="Arial" w:hAnsi="Arial"/>
+          <w:rFonts w:ascii="Times New Roman" w:hAnsi="Times New Roman"/>
           <w:b/>
-          <w:sz w:val="21"/>
+          <w:color w:val="000000"/>
+          <w:sz w:val="26"/>
         </w:rPr>
-        <w:t xml:space="preserve">git push origin &lt;tên_nhánh&gt;: </w:t>
+        <w:t xml:space="preserve">git stash pop: </w:t>
       </w:r>
       <w:r>
         <w:rPr>
-          <w:rFonts w:ascii="Arial" w:hAnsi="Arial"/>
-          <w:color w:val="222222"/>
-          <w:sz w:val="21"/>
+          <w:rFonts w:ascii="Times New Roman" w:hAnsi="Times New Roman"/>
+          <w:color w:val="000000"/>
+          <w:sz w:val="26"/>
         </w:rPr>
-        <w:t>Dùng để đẩy toàn bộ các commit từ máy tính cá nhân lên kho lưu trữ trên GitHub để lưu trữ và chia sẻ.</w:t>
-      </w:r>
-    </w:p>
-    <w:p>
-      <w:pPr>
-        <w:pStyle w:val="ListBullet"/>
-        <w:spacing w:before="0" w:after="60" w:line="276" w:lineRule="auto"/>
-      </w:pPr>
-      <w:r>
-        <w:rPr>
-          <w:rFonts w:ascii="Arial" w:hAnsi="Arial"/>
-          <w:b/>
-          <w:sz w:val="21"/>
-        </w:rPr>
-        <w:t xml:space="preserve">git push -u origin &lt;tên_nhánh&gt;: </w:t>
-      </w:r>
-      <w:r>
-        <w:rPr>
-          <w:rFonts w:ascii="Arial" w:hAnsi="Arial"/>
-          <w:color w:val="222222"/>
-          <w:sz w:val="21"/>
-        </w:rPr>
-        <w:t>Dùng để đẩy code lên GitHub và đồng thời ghi nhớ cấu hình liên kết nhánh (upstream), giúp các lần sau chỉ cần gõ vắn tắt 'git push'.</w:t>
-      </w:r>
-    </w:p>
-    <w:p>
-      <w:pPr>
-        <w:pStyle w:val="ListBullet"/>
-        <w:spacing w:before="0" w:after="60" w:line="276" w:lineRule="auto"/>
-      </w:pPr>
-      <w:r>
-        <w:rPr>
-          <w:rFonts w:ascii="Arial" w:hAnsi="Arial"/>
-          <w:b/>
-          <w:sz w:val="21"/>
-        </w:rPr>
-        <w:t xml:space="preserve">git pull origin &lt;tên_nhánh&gt;: </w:t>
-      </w:r>
-      <w:r>
-        <w:rPr>
-          <w:rFonts w:ascii="Arial" w:hAnsi="Arial"/>
-          <w:color w:val="222222"/>
-          <w:sz w:val="21"/>
-        </w:rPr>
-        <w:t>Dùng để tải những thay đổi mới nhất từ GitHub về máy và tự động gộp (merge) vào mã nguồn bạn đang làm.</w:t>
-      </w:r>
-    </w:p>
-    <w:p>
-      <w:pPr>
-        <w:pStyle w:val="ListBullet"/>
-        <w:spacing w:before="0" w:after="60" w:line="276" w:lineRule="auto"/>
-      </w:pPr>
-      <w:r>
-        <w:rPr>
-          <w:rFonts w:ascii="Arial" w:hAnsi="Arial"/>
-          <w:b/>
-          <w:sz w:val="21"/>
-        </w:rPr>
-        <w:t xml:space="preserve">git fetch origin: </w:t>
-      </w:r>
-      <w:r>
-        <w:rPr>
-          <w:rFonts w:ascii="Arial" w:hAnsi="Arial"/>
-          <w:color w:val="222222"/>
-          <w:sz w:val="21"/>
-        </w:rPr>
-        <w:t>Dùng để tải toàn bộ thông tin commit và nhánh mới từ GitHub về máy nhưng CHƯA gộp vào code đang chạy.</w:t>
+        <w:t>Lấy lại các đoạn code đã cất tạm ra để tiếp tục làm việc.</w:t>
       </w:r>
     </w:p>
     <w:p>
       <w:pPr>
         <w:keepNext/>
-        <w:spacing w:before="240" w:after="80"/>
+        <w:spacing w:before="280" w:after="80"/>
       </w:pPr>
       <w:r>
         <w:rPr>
-          <w:rFonts w:ascii="Arial" w:hAnsi="Arial"/>
+          <w:rFonts w:ascii="Times New Roman" w:hAnsi="Times New Roman"/>
           <w:b/>
-          <w:color w:val="2E75B6"/>
-          <w:sz w:val="23"/>
+          <w:color w:val="000000"/>
+          <w:sz w:val="30"/>
         </w:rPr>
-        <w:t>2.6. Nhóm Hoàn tác (Undo) &amp; Lưu trữ Tạm thời (Stash)</w:t>
-      </w:r>
-    </w:p>
-    <w:p>
-      <w:pPr>
-        <w:pStyle w:val="ListBullet"/>
-        <w:spacing w:before="0" w:after="60" w:line="276" w:lineRule="auto"/>
-      </w:pPr>
-      <w:r>
-        <w:rPr>
-          <w:rFonts w:ascii="Arial" w:hAnsi="Arial"/>
-          <w:b/>
-          <w:sz w:val="21"/>
-        </w:rPr>
-        <w:t xml:space="preserve">git restore &lt;tên_file&gt;: </w:t>
-      </w:r>
-      <w:r>
-        <w:rPr>
-          <w:rFonts w:ascii="Arial" w:hAnsi="Arial"/>
-          <w:color w:val="222222"/>
-          <w:sz w:val="21"/>
-        </w:rPr>
-        <w:t>Dùng để hủy bỏ các thay đổi chưa được staged của một file, đưa file trở lại nguyên bản ở commit gần nhất.</w:t>
-      </w:r>
-    </w:p>
-    <w:p>
-      <w:pPr>
-        <w:pStyle w:val="ListBullet"/>
-        <w:spacing w:before="0" w:after="60" w:line="276" w:lineRule="auto"/>
-      </w:pPr>
-      <w:r>
-        <w:rPr>
-          <w:rFonts w:ascii="Arial" w:hAnsi="Arial"/>
-          <w:b/>
-          <w:sz w:val="21"/>
-        </w:rPr>
-        <w:t xml:space="preserve">git restore --staged &lt;tên_file&gt;: </w:t>
-      </w:r>
-      <w:r>
-        <w:rPr>
-          <w:rFonts w:ascii="Arial" w:hAnsi="Arial"/>
-          <w:color w:val="222222"/>
-          <w:sz w:val="21"/>
-        </w:rPr>
-        <w:t>Dùng để rút một file ra khỏi Staging Area trở về trạng thái bình thường mà không làm mất nội dung vừa viết.</w:t>
-      </w:r>
-    </w:p>
-    <w:p>
-      <w:pPr>
-        <w:pStyle w:val="ListBullet"/>
-        <w:spacing w:before="0" w:after="60" w:line="276" w:lineRule="auto"/>
-      </w:pPr>
-      <w:r>
-        <w:rPr>
-          <w:rFonts w:ascii="Arial" w:hAnsi="Arial"/>
-          <w:b/>
-          <w:sz w:val="21"/>
-        </w:rPr>
-        <w:t xml:space="preserve">git reset --soft &lt;commit_id&gt;: </w:t>
-      </w:r>
-      <w:r>
-        <w:rPr>
-          <w:rFonts w:ascii="Arial" w:hAnsi="Arial"/>
-          <w:color w:val="222222"/>
-          <w:sz w:val="21"/>
-        </w:rPr>
-        <w:t>Dùng để lùi lại các commit cũ nhưng vẫn giữ nguyên vẹn nội dung code trên máy tính.</w:t>
-      </w:r>
-    </w:p>
-    <w:p>
-      <w:pPr>
-        <w:pStyle w:val="ListBullet"/>
-        <w:spacing w:before="0" w:after="60" w:line="276" w:lineRule="auto"/>
-      </w:pPr>
-      <w:r>
-        <w:rPr>
-          <w:rFonts w:ascii="Arial" w:hAnsi="Arial"/>
-          <w:b/>
-          <w:sz w:val="21"/>
-        </w:rPr>
-        <w:t xml:space="preserve">git reset --hard &lt;commit_id&gt;: </w:t>
-      </w:r>
-      <w:r>
-        <w:rPr>
-          <w:rFonts w:ascii="Arial" w:hAnsi="Arial"/>
-          <w:color w:val="222222"/>
-          <w:sz w:val="21"/>
-        </w:rPr>
-        <w:t>CẨN TRỌNG: Dùng để hủy commit và xóa sạch toàn bộ mã nguồn thay đổi sau commit đó, đưa repo về đúng quá khứ.</w:t>
-      </w:r>
-    </w:p>
-    <w:p>
-      <w:pPr>
-        <w:pStyle w:val="ListBullet"/>
-        <w:spacing w:before="0" w:after="60" w:line="276" w:lineRule="auto"/>
-      </w:pPr>
-      <w:r>
-        <w:rPr>
-          <w:rFonts w:ascii="Arial" w:hAnsi="Arial"/>
-          <w:b/>
-          <w:sz w:val="21"/>
-        </w:rPr>
-        <w:t xml:space="preserve">git revert &lt;commit_id&gt;: </w:t>
-      </w:r>
-      <w:r>
-        <w:rPr>
-          <w:rFonts w:ascii="Arial" w:hAnsi="Arial"/>
-          <w:color w:val="222222"/>
-          <w:sz w:val="21"/>
-        </w:rPr>
-        <w:t>Dùng để tạo một commit mới đảo ngược lại tác vụ của một commit cũ bị lỗi, an toàn tuyệt đối cho dự án nhóm.</w:t>
-      </w:r>
-    </w:p>
-    <w:p>
-      <w:pPr>
-        <w:pStyle w:val="ListBullet"/>
-        <w:spacing w:before="0" w:after="60" w:line="276" w:lineRule="auto"/>
-      </w:pPr>
-      <w:r>
-        <w:rPr>
-          <w:rFonts w:ascii="Arial" w:hAnsi="Arial"/>
-          <w:b/>
-          <w:sz w:val="21"/>
-        </w:rPr>
-        <w:t xml:space="preserve">git stash: </w:t>
-      </w:r>
-      <w:r>
-        <w:rPr>
-          <w:rFonts w:ascii="Arial" w:hAnsi="Arial"/>
-          <w:color w:val="222222"/>
-          <w:sz w:val="21"/>
-        </w:rPr>
-        <w:t>Dùng để 'cất tạm' các dòng code dở dang vào bộ nhớ tạm để cây làm việc sạch sẽ khi cần đổi nhánh xử lý việc khẩn cấp.</w:t>
-      </w:r>
-    </w:p>
-    <w:p>
-      <w:pPr>
-        <w:pStyle w:val="ListBullet"/>
-        <w:spacing w:before="0" w:after="60" w:line="276" w:lineRule="auto"/>
-      </w:pPr>
-      <w:r>
-        <w:rPr>
-          <w:rFonts w:ascii="Arial" w:hAnsi="Arial"/>
-          <w:b/>
-          <w:sz w:val="21"/>
-        </w:rPr>
-        <w:t xml:space="preserve">git stash pop: </w:t>
-      </w:r>
-      <w:r>
-        <w:rPr>
-          <w:rFonts w:ascii="Arial" w:hAnsi="Arial"/>
-          <w:color w:val="222222"/>
-          <w:sz w:val="21"/>
-        </w:rPr>
-        <w:t>Dùng để lấy lại toàn bộ các đoạn code dở dang đã cất trong stash ra tiếp tục làm việc.</w:t>
-      </w:r>
-    </w:p>
-    <w:tbl>
-      <w:tblPr>
-        <w:tblW w:type="auto" w:w="0"/>
-        <w:jc w:val="center"/>
-        <w:tblLayout w:type="fixed"/>
-        <w:tblLook w:firstColumn="1" w:firstRow="1" w:lastColumn="0" w:lastRow="0" w:noHBand="0" w:noVBand="1" w:val="04A0"/>
-      </w:tblPr>
-      <w:tblGrid>
-        <w:gridCol w:w="9360"/>
-      </w:tblGrid>
-      <w:tr>
-        <w:tc>
-          <w:tcPr>
-            <w:tcW w:type="dxa" w:w="9936"/>
-            <w:shd w:fill="F0F4F8"/>
-            <w:tcMar>
-              <w:top w:w="140" w:type="dxa"/>
-              <w:bottom w:w="140" w:type="dxa"/>
-              <w:left w:w="200" w:type="dxa"/>
-              <w:right w:w="180" w:type="dxa"/>
-            </w:tcMar>
-            <w:tcBorders>
-              <w:top w:val="none"/>
-              <w:left w:val="single" w:sz="24" w:space="0" w:color="1F4E79"/>
-              <w:bottom w:val="none"/>
-              <w:right w:val="none"/>
-            </w:tcBorders>
-          </w:tcPr>
-          <w:p>
-            <w:pPr>
-              <w:spacing w:before="0" w:after="80"/>
-            </w:pPr>
-            <w:r>
-              <w:rPr>
-                <w:rFonts w:ascii="Arial" w:hAnsi="Arial"/>
-                <w:b/>
-                <w:color w:val="1F4E79"/>
-                <w:sz w:val="21"/>
-              </w:rPr>
-              <w:t xml:space="preserve">QUY TẮC QUẢN LÝ MÃ NGUỒN CHUẨN: </w:t>
-            </w:r>
-            <w:r>
-              <w:rPr>
-                <w:rFonts w:ascii="Arial" w:hAnsi="Arial"/>
-                <w:color w:val="333333"/>
-                <w:sz w:val="20"/>
-              </w:rPr>
-              <w:t>Trong mô hình quản lý phần mềm hiện đại, quy tắc vàng là: Không bao giờ commit trực tiếp lên nhánh 'main' hay 'master'. Mọi tính năng hay sửa lỗi đều phải tạo nhánh riêng (feature branch) và gửi Pull Request để đồng đội review trước khi gộp.</w:t>
-            </w:r>
-          </w:p>
-        </w:tc>
-      </w:tr>
-    </w:tbl>
-    <w:p>
-      <w:pPr>
-        <w:keepNext/>
-        <w:spacing w:before="320" w:after="120"/>
-      </w:pPr>
-      <w:r>
-        <w:rPr>
-          <w:rFonts w:ascii="Arial" w:hAnsi="Arial"/>
-          <w:b/>
-          <w:color w:val="1F4E79"/>
-          <w:sz w:val="27"/>
-        </w:rPr>
-        <w:t>3. BẢNG TỔNG HỢP TRA CỨU NHANH CÁC LỆNH GIT (GIT CHEAT SHEET)</w:t>
-      </w:r>
-    </w:p>
-    <w:p>
-      <w:pPr>
-        <w:spacing w:before="0" w:after="120" w:line="288" w:lineRule="auto"/>
-      </w:pPr>
-      <w:r>
-        <w:rPr>
-          <w:rFonts w:ascii="Arial" w:hAnsi="Arial"/>
-          <w:color w:val="222222"/>
-          <w:sz w:val="21"/>
-        </w:rPr>
-        <w:t>Bảng tra cứu nhanh 16 câu lệnh Git quan trọng nhất được sử dụng trong thực tế:</w:t>
+        <w:t>3. BẢNG TRA CỨU NHANH CÁC LỆNH GIT THƯỜNG DÙNG</w:t>
       </w:r>
     </w:p>
     <w:tbl>
@@ -1903,12 +1230,12 @@
         <w:tblLayout w:type="fixed"/>
         <w:tblLook w:firstColumn="1" w:firstRow="1" w:lastColumn="0" w:lastRow="0" w:noHBand="0" w:noVBand="1" w:val="04A0"/>
         <w:tblBorders>
-          <w:top w:val="single" w:sz="4" w:space="0" w:color="D0D7DE"/>
-          <w:bottom w:val="single" w:sz="4" w:space="0" w:color="D0D7DE"/>
-          <w:left w:val="none"/>
-          <w:right w:val="none"/>
-          <w:insideH w:val="single" w:sz="4" w:space="0" w:color="D0D7DE"/>
-          <w:insideV w:val="none"/>
+          <w:top w:val="single" w:sz="4" w:space="0" w:color="000000"/>
+          <w:bottom w:val="single" w:sz="4" w:space="0" w:color="000000"/>
+          <w:left w:val="single" w:sz="4" w:space="0" w:color="000000"/>
+          <w:right w:val="single" w:sz="4" w:space="0" w:color="000000"/>
+          <w:insideH w:val="single" w:sz="4" w:space="0" w:color="000000"/>
+          <w:insideV w:val="single" w:sz="4" w:space="0" w:color="000000"/>
         </w:tblBorders>
       </w:tblPr>
       <w:tblGrid>
@@ -1924,12 +1251,12 @@
         <w:tc>
           <w:tcPr>
             <w:tcW w:type="dxa" w:w="720"/>
-            <w:shd w:fill="1F4E79"/>
+            <w:shd w:fill="EEEEEE"/>
             <w:tcMar>
-              <w:top w:w="120" w:type="dxa"/>
-              <w:bottom w:w="120" w:type="dxa"/>
-              <w:left w:w="140" w:type="dxa"/>
-              <w:right w:w="140" w:type="dxa"/>
+              <w:top w:w="100" w:type="dxa"/>
+              <w:bottom w:w="100" w:type="dxa"/>
+              <w:left w:w="120" w:type="dxa"/>
+              <w:right w:w="120" w:type="dxa"/>
             </w:tcMar>
           </w:tcPr>
           <w:p>
@@ -1939,10 +1266,10 @@
             </w:pPr>
             <w:r>
               <w:rPr>
-                <w:rFonts w:ascii="Arial" w:hAnsi="Arial"/>
+                <w:rFonts w:ascii="Times New Roman" w:hAnsi="Times New Roman"/>
                 <w:b/>
-                <w:color w:val="FFFFFF"/>
-                <w:sz w:val="20"/>
+                <w:color w:val="000000"/>
+                <w:sz w:val="26"/>
               </w:rPr>
               <w:t>STT</w:t>
             </w:r>
@@ -1951,12 +1278,12 @@
         <w:tc>
           <w:tcPr>
             <w:tcW w:type="dxa" w:w="2880"/>
-            <w:shd w:fill="1F4E79"/>
+            <w:shd w:fill="EEEEEE"/>
             <w:tcMar>
-              <w:top w:w="120" w:type="dxa"/>
-              <w:bottom w:w="120" w:type="dxa"/>
-              <w:left w:w="140" w:type="dxa"/>
-              <w:right w:w="140" w:type="dxa"/>
+              <w:top w:w="100" w:type="dxa"/>
+              <w:bottom w:w="100" w:type="dxa"/>
+              <w:left w:w="120" w:type="dxa"/>
+              <w:right w:w="120" w:type="dxa"/>
             </w:tcMar>
           </w:tcPr>
           <w:p>
@@ -1965,24 +1292,24 @@
             </w:pPr>
             <w:r>
               <w:rPr>
-                <w:rFonts w:ascii="Arial" w:hAnsi="Arial"/>
+                <w:rFonts w:ascii="Times New Roman" w:hAnsi="Times New Roman"/>
                 <w:b/>
-                <w:color w:val="FFFFFF"/>
-                <w:sz w:val="20"/>
+                <w:color w:val="000000"/>
+                <w:sz w:val="26"/>
               </w:rPr>
-              <w:t>Câu lệnh Git</w:t>
+              <w:t>Lệnh Git</w:t>
             </w:r>
           </w:p>
         </w:tc>
         <w:tc>
           <w:tcPr>
             <w:tcW w:type="dxa" w:w="3168"/>
-            <w:shd w:fill="1F4E79"/>
+            <w:shd w:fill="EEEEEE"/>
             <w:tcMar>
-              <w:top w:w="120" w:type="dxa"/>
-              <w:bottom w:w="120" w:type="dxa"/>
-              <w:left w:w="140" w:type="dxa"/>
-              <w:right w:w="140" w:type="dxa"/>
+              <w:top w:w="100" w:type="dxa"/>
+              <w:bottom w:w="100" w:type="dxa"/>
+              <w:left w:w="120" w:type="dxa"/>
+              <w:right w:w="120" w:type="dxa"/>
             </w:tcMar>
           </w:tcPr>
           <w:p>
@@ -1991,24 +1318,24 @@
             </w:pPr>
             <w:r>
               <w:rPr>
-                <w:rFonts w:ascii="Arial" w:hAnsi="Arial"/>
+                <w:rFonts w:ascii="Times New Roman" w:hAnsi="Times New Roman"/>
                 <w:b/>
-                <w:color w:val="FFFFFF"/>
-                <w:sz w:val="20"/>
+                <w:color w:val="000000"/>
+                <w:sz w:val="26"/>
               </w:rPr>
-              <w:t>Dùng để làm gì?</w:t>
+              <w:t>Công dụng chính</w:t>
             </w:r>
           </w:p>
         </w:tc>
         <w:tc>
           <w:tcPr>
             <w:tcW w:type="dxa" w:w="2592"/>
-            <w:shd w:fill="1F4E79"/>
+            <w:shd w:fill="EEEEEE"/>
             <w:tcMar>
-              <w:top w:w="120" w:type="dxa"/>
-              <w:bottom w:w="120" w:type="dxa"/>
-              <w:left w:w="140" w:type="dxa"/>
-              <w:right w:w="140" w:type="dxa"/>
+              <w:top w:w="100" w:type="dxa"/>
+              <w:bottom w:w="100" w:type="dxa"/>
+              <w:left w:w="120" w:type="dxa"/>
+              <w:right w:w="120" w:type="dxa"/>
             </w:tcMar>
           </w:tcPr>
           <w:p>
@@ -2017,12 +1344,12 @@
             </w:pPr>
             <w:r>
               <w:rPr>
-                <w:rFonts w:ascii="Arial" w:hAnsi="Arial"/>
+                <w:rFonts w:ascii="Times New Roman" w:hAnsi="Times New Roman"/>
                 <w:b/>
-                <w:color w:val="FFFFFF"/>
-                <w:sz w:val="20"/>
+                <w:color w:val="000000"/>
+                <w:sz w:val="26"/>
               </w:rPr>
-              <w:t>Tình huống áp dụng</w:t>
+              <w:t>Ví dụ áp dụng</w:t>
             </w:r>
           </w:p>
         </w:tc>
@@ -2032,10 +1359,10 @@
           <w:tcPr>
             <w:tcW w:type="dxa" w:w="720"/>
             <w:tcMar>
-              <w:top w:w="100" w:type="dxa"/>
-              <w:bottom w:w="100" w:type="dxa"/>
-              <w:left w:w="140" w:type="dxa"/>
-              <w:right w:w="140" w:type="dxa"/>
+              <w:top w:w="80" w:type="dxa"/>
+              <w:bottom w:w="80" w:type="dxa"/>
+              <w:left w:w="120" w:type="dxa"/>
+              <w:right w:w="120" w:type="dxa"/>
             </w:tcMar>
           </w:tcPr>
           <w:p>
@@ -2045,9 +1372,9 @@
             </w:pPr>
             <w:r>
               <w:rPr>
-                <w:rFonts w:ascii="Arial" w:hAnsi="Arial"/>
-                <w:color w:val="333333"/>
-                <w:sz w:val="19"/>
+                <w:rFonts w:ascii="Times New Roman" w:hAnsi="Times New Roman"/>
+                <w:color w:val="000000"/>
+                <w:sz w:val="24"/>
               </w:rPr>
               <w:t>1</w:t>
             </w:r>
@@ -2057,10 +1384,10 @@
           <w:tcPr>
             <w:tcW w:type="dxa" w:w="2880"/>
             <w:tcMar>
-              <w:top w:w="100" w:type="dxa"/>
-              <w:bottom w:w="100" w:type="dxa"/>
-              <w:left w:w="140" w:type="dxa"/>
-              <w:right w:w="140" w:type="dxa"/>
+              <w:top w:w="80" w:type="dxa"/>
+              <w:bottom w:w="80" w:type="dxa"/>
+              <w:left w:w="120" w:type="dxa"/>
+              <w:right w:w="120" w:type="dxa"/>
             </w:tcMar>
           </w:tcPr>
           <w:p>
@@ -2069,10 +1396,10 @@
             </w:pPr>
             <w:r>
               <w:rPr>
-                <w:rFonts w:ascii="Consolas" w:hAnsi="Consolas"/>
+                <w:rFonts w:ascii="Times New Roman" w:hAnsi="Times New Roman"/>
                 <w:b/>
-                <w:color w:val="0969DA"/>
-                <w:sz w:val="19"/>
+                <w:color w:val="000000"/>
+                <w:sz w:val="24"/>
               </w:rPr>
               <w:t>git init</w:t>
             </w:r>
@@ -2082,10 +1409,10 @@
           <w:tcPr>
             <w:tcW w:type="dxa" w:w="3168"/>
             <w:tcMar>
-              <w:top w:w="100" w:type="dxa"/>
-              <w:bottom w:w="100" w:type="dxa"/>
-              <w:left w:w="140" w:type="dxa"/>
-              <w:right w:w="140" w:type="dxa"/>
+              <w:top w:w="80" w:type="dxa"/>
+              <w:bottom w:w="80" w:type="dxa"/>
+              <w:left w:w="120" w:type="dxa"/>
+              <w:right w:w="120" w:type="dxa"/>
             </w:tcMar>
           </w:tcPr>
           <w:p>
@@ -2094,11 +1421,11 @@
             </w:pPr>
             <w:r>
               <w:rPr>
-                <w:rFonts w:ascii="Arial" w:hAnsi="Arial"/>
-                <w:color w:val="333333"/>
-                <w:sz w:val="19"/>
+                <w:rFonts w:ascii="Times New Roman" w:hAnsi="Times New Roman"/>
+                <w:color w:val="000000"/>
+                <w:sz w:val="24"/>
               </w:rPr>
-              <w:t>Khởi tạo Git repo mới</w:t>
+              <w:t>Tạo repo mới</w:t>
             </w:r>
           </w:p>
         </w:tc>
@@ -2106,10 +1433,10 @@
           <w:tcPr>
             <w:tcW w:type="dxa" w:w="2592"/>
             <w:tcMar>
-              <w:top w:w="100" w:type="dxa"/>
-              <w:bottom w:w="100" w:type="dxa"/>
-              <w:left w:w="140" w:type="dxa"/>
-              <w:right w:w="140" w:type="dxa"/>
+              <w:top w:w="80" w:type="dxa"/>
+              <w:bottom w:w="80" w:type="dxa"/>
+              <w:left w:w="120" w:type="dxa"/>
+              <w:right w:w="120" w:type="dxa"/>
             </w:tcMar>
           </w:tcPr>
           <w:p>
@@ -2118,11 +1445,11 @@
             </w:pPr>
             <w:r>
               <w:rPr>
-                <w:rFonts w:ascii="Arial" w:hAnsi="Arial"/>
-                <w:color w:val="333333"/>
-                <w:sz w:val="19"/>
+                <w:rFonts w:ascii="Times New Roman" w:hAnsi="Times New Roman"/>
+                <w:color w:val="000000"/>
+                <w:sz w:val="24"/>
               </w:rPr>
-              <w:t>Bắt đầu dự án mới trong thư mục rỗng</w:t>
+              <w:t>Bắt đầu làm bài tập/dự án mới</w:t>
             </w:r>
           </w:p>
         </w:tc>
@@ -2131,12 +1458,11 @@
         <w:tc>
           <w:tcPr>
             <w:tcW w:type="dxa" w:w="720"/>
-            <w:shd w:fill="F9FAFB"/>
             <w:tcMar>
-              <w:top w:w="100" w:type="dxa"/>
-              <w:bottom w:w="100" w:type="dxa"/>
-              <w:left w:w="140" w:type="dxa"/>
-              <w:right w:w="140" w:type="dxa"/>
+              <w:top w:w="80" w:type="dxa"/>
+              <w:bottom w:w="80" w:type="dxa"/>
+              <w:left w:w="120" w:type="dxa"/>
+              <w:right w:w="120" w:type="dxa"/>
             </w:tcMar>
           </w:tcPr>
           <w:p>
@@ -2146,9 +1472,9 @@
             </w:pPr>
             <w:r>
               <w:rPr>
-                <w:rFonts w:ascii="Arial" w:hAnsi="Arial"/>
-                <w:color w:val="333333"/>
-                <w:sz w:val="19"/>
+                <w:rFonts w:ascii="Times New Roman" w:hAnsi="Times New Roman"/>
+                <w:color w:val="000000"/>
+                <w:sz w:val="24"/>
               </w:rPr>
               <w:t>2</w:t>
             </w:r>
@@ -2157,12 +1483,11 @@
         <w:tc>
           <w:tcPr>
             <w:tcW w:type="dxa" w:w="2880"/>
-            <w:shd w:fill="F9FAFB"/>
             <w:tcMar>
-              <w:top w:w="100" w:type="dxa"/>
-              <w:bottom w:w="100" w:type="dxa"/>
-              <w:left w:w="140" w:type="dxa"/>
-              <w:right w:w="140" w:type="dxa"/>
+              <w:top w:w="80" w:type="dxa"/>
+              <w:bottom w:w="80" w:type="dxa"/>
+              <w:left w:w="120" w:type="dxa"/>
+              <w:right w:w="120" w:type="dxa"/>
             </w:tcMar>
           </w:tcPr>
           <w:p>
@@ -2171,10 +1496,10 @@
             </w:pPr>
             <w:r>
               <w:rPr>
-                <w:rFonts w:ascii="Consolas" w:hAnsi="Consolas"/>
+                <w:rFonts w:ascii="Times New Roman" w:hAnsi="Times New Roman"/>
                 <w:b/>
-                <w:color w:val="0969DA"/>
-                <w:sz w:val="19"/>
+                <w:color w:val="000000"/>
+                <w:sz w:val="24"/>
               </w:rPr>
               <w:t>git clone &lt;url&gt;</w:t>
             </w:r>
@@ -2183,12 +1508,11 @@
         <w:tc>
           <w:tcPr>
             <w:tcW w:type="dxa" w:w="3168"/>
-            <w:shd w:fill="F9FAFB"/>
             <w:tcMar>
-              <w:top w:w="100" w:type="dxa"/>
-              <w:bottom w:w="100" w:type="dxa"/>
-              <w:left w:w="140" w:type="dxa"/>
-              <w:right w:w="140" w:type="dxa"/>
+              <w:top w:w="80" w:type="dxa"/>
+              <w:bottom w:w="80" w:type="dxa"/>
+              <w:left w:w="120" w:type="dxa"/>
+              <w:right w:w="120" w:type="dxa"/>
             </w:tcMar>
           </w:tcPr>
           <w:p>
@@ -2197,23 +1521,22 @@
             </w:pPr>
             <w:r>
               <w:rPr>
-                <w:rFonts w:ascii="Arial" w:hAnsi="Arial"/>
-                <w:color w:val="333333"/>
-                <w:sz w:val="19"/>
+                <w:rFonts w:ascii="Times New Roman" w:hAnsi="Times New Roman"/>
+                <w:color w:val="000000"/>
+                <w:sz w:val="24"/>
               </w:rPr>
-              <w:t>Tải repo từ GitHub về máy</w:t>
+              <w:t>Tải repo về máy</w:t>
             </w:r>
           </w:p>
         </w:tc>
         <w:tc>
           <w:tcPr>
             <w:tcW w:type="dxa" w:w="2592"/>
-            <w:shd w:fill="F9FAFB"/>
             <w:tcMar>
-              <w:top w:w="100" w:type="dxa"/>
-              <w:bottom w:w="100" w:type="dxa"/>
-              <w:left w:w="140" w:type="dxa"/>
-              <w:right w:w="140" w:type="dxa"/>
+              <w:top w:w="80" w:type="dxa"/>
+              <w:bottom w:w="80" w:type="dxa"/>
+              <w:left w:w="120" w:type="dxa"/>
+              <w:right w:w="120" w:type="dxa"/>
             </w:tcMar>
           </w:tcPr>
           <w:p>
@@ -2222,11 +1545,11 @@
             </w:pPr>
             <w:r>
               <w:rPr>
-                <w:rFonts w:ascii="Arial" w:hAnsi="Arial"/>
-                <w:color w:val="333333"/>
-                <w:sz w:val="19"/>
+                <w:rFonts w:ascii="Times New Roman" w:hAnsi="Times New Roman"/>
+                <w:color w:val="000000"/>
+                <w:sz w:val="24"/>
               </w:rPr>
-              <w:t>Kéo dự án của nhóm về máy cá nhân để làm việc</w:t>
+              <w:t>Kéo dự án mẫu từ GitHub về</w:t>
             </w:r>
           </w:p>
         </w:tc>
@@ -2236,10 +1559,10 @@
           <w:tcPr>
             <w:tcW w:type="dxa" w:w="720"/>
             <w:tcMar>
-              <w:top w:w="100" w:type="dxa"/>
-              <w:bottom w:w="100" w:type="dxa"/>
-              <w:left w:w="140" w:type="dxa"/>
-              <w:right w:w="140" w:type="dxa"/>
+              <w:top w:w="80" w:type="dxa"/>
+              <w:bottom w:w="80" w:type="dxa"/>
+              <w:left w:w="120" w:type="dxa"/>
+              <w:right w:w="120" w:type="dxa"/>
             </w:tcMar>
           </w:tcPr>
           <w:p>
@@ -2249,9 +1572,9 @@
             </w:pPr>
             <w:r>
               <w:rPr>
-                <w:rFonts w:ascii="Arial" w:hAnsi="Arial"/>
-                <w:color w:val="333333"/>
-                <w:sz w:val="19"/>
+                <w:rFonts w:ascii="Times New Roman" w:hAnsi="Times New Roman"/>
+                <w:color w:val="000000"/>
+                <w:sz w:val="24"/>
               </w:rPr>
               <w:t>3</w:t>
             </w:r>
@@ -2261,10 +1584,10 @@
           <w:tcPr>
             <w:tcW w:type="dxa" w:w="2880"/>
             <w:tcMar>
-              <w:top w:w="100" w:type="dxa"/>
-              <w:bottom w:w="100" w:type="dxa"/>
-              <w:left w:w="140" w:type="dxa"/>
-              <w:right w:w="140" w:type="dxa"/>
+              <w:top w:w="80" w:type="dxa"/>
+              <w:bottom w:w="80" w:type="dxa"/>
+              <w:left w:w="120" w:type="dxa"/>
+              <w:right w:w="120" w:type="dxa"/>
             </w:tcMar>
           </w:tcPr>
           <w:p>
@@ -2273,10 +1596,10 @@
             </w:pPr>
             <w:r>
               <w:rPr>
-                <w:rFonts w:ascii="Consolas" w:hAnsi="Consolas"/>
+                <w:rFonts w:ascii="Times New Roman" w:hAnsi="Times New Roman"/>
                 <w:b/>
-                <w:color w:val="0969DA"/>
-                <w:sz w:val="19"/>
+                <w:color w:val="000000"/>
+                <w:sz w:val="24"/>
               </w:rPr>
               <w:t>git status</w:t>
             </w:r>
@@ -2286,10 +1609,10 @@
           <w:tcPr>
             <w:tcW w:type="dxa" w:w="3168"/>
             <w:tcMar>
-              <w:top w:w="100" w:type="dxa"/>
-              <w:bottom w:w="100" w:type="dxa"/>
-              <w:left w:w="140" w:type="dxa"/>
-              <w:right w:w="140" w:type="dxa"/>
+              <w:top w:w="80" w:type="dxa"/>
+              <w:bottom w:w="80" w:type="dxa"/>
+              <w:left w:w="120" w:type="dxa"/>
+              <w:right w:w="120" w:type="dxa"/>
             </w:tcMar>
           </w:tcPr>
           <w:p>
@@ -2298,11 +1621,11 @@
             </w:pPr>
             <w:r>
               <w:rPr>
-                <w:rFonts w:ascii="Arial" w:hAnsi="Arial"/>
-                <w:color w:val="333333"/>
-                <w:sz w:val="19"/>
+                <w:rFonts w:ascii="Times New Roman" w:hAnsi="Times New Roman"/>
+                <w:color w:val="000000"/>
+                <w:sz w:val="24"/>
               </w:rPr>
-              <w:t>Kiểm tra tình trạng file</w:t>
+              <w:t>Xem trạng thái</w:t>
             </w:r>
           </w:p>
         </w:tc>
@@ -2310,10 +1633,10 @@
           <w:tcPr>
             <w:tcW w:type="dxa" w:w="2592"/>
             <w:tcMar>
-              <w:top w:w="100" w:type="dxa"/>
-              <w:bottom w:w="100" w:type="dxa"/>
-              <w:left w:w="140" w:type="dxa"/>
-              <w:right w:w="140" w:type="dxa"/>
+              <w:top w:w="80" w:type="dxa"/>
+              <w:bottom w:w="80" w:type="dxa"/>
+              <w:left w:w="120" w:type="dxa"/>
+              <w:right w:w="120" w:type="dxa"/>
             </w:tcMar>
           </w:tcPr>
           <w:p>
@@ -2322,11 +1645,11 @@
             </w:pPr>
             <w:r>
               <w:rPr>
-                <w:rFonts w:ascii="Arial" w:hAnsi="Arial"/>
-                <w:color w:val="333333"/>
-                <w:sz w:val="19"/>
+                <w:rFonts w:ascii="Times New Roman" w:hAnsi="Times New Roman"/>
+                <w:color w:val="000000"/>
+                <w:sz w:val="24"/>
               </w:rPr>
-              <w:t>Xem file nào đang sửa đổi, file nào chưa add</w:t>
+              <w:t>Kiểm tra file nào đã sửa</w:t>
             </w:r>
           </w:p>
         </w:tc>
@@ -2335,12 +1658,11 @@
         <w:tc>
           <w:tcPr>
             <w:tcW w:type="dxa" w:w="720"/>
-            <w:shd w:fill="F9FAFB"/>
             <w:tcMar>
-              <w:top w:w="100" w:type="dxa"/>
-              <w:bottom w:w="100" w:type="dxa"/>
-              <w:left w:w="140" w:type="dxa"/>
-              <w:right w:w="140" w:type="dxa"/>
+              <w:top w:w="80" w:type="dxa"/>
+              <w:bottom w:w="80" w:type="dxa"/>
+              <w:left w:w="120" w:type="dxa"/>
+              <w:right w:w="120" w:type="dxa"/>
             </w:tcMar>
           </w:tcPr>
           <w:p>
@@ -2350,9 +1672,9 @@
             </w:pPr>
             <w:r>
               <w:rPr>
-                <w:rFonts w:ascii="Arial" w:hAnsi="Arial"/>
-                <w:color w:val="333333"/>
-                <w:sz w:val="19"/>
+                <w:rFonts w:ascii="Times New Roman" w:hAnsi="Times New Roman"/>
+                <w:color w:val="000000"/>
+                <w:sz w:val="24"/>
               </w:rPr>
               <w:t>4</w:t>
             </w:r>
@@ -2361,12 +1683,11 @@
         <w:tc>
           <w:tcPr>
             <w:tcW w:type="dxa" w:w="2880"/>
-            <w:shd w:fill="F9FAFB"/>
             <w:tcMar>
-              <w:top w:w="100" w:type="dxa"/>
-              <w:bottom w:w="100" w:type="dxa"/>
-              <w:left w:w="140" w:type="dxa"/>
-              <w:right w:w="140" w:type="dxa"/>
+              <w:top w:w="80" w:type="dxa"/>
+              <w:bottom w:w="80" w:type="dxa"/>
+              <w:left w:w="120" w:type="dxa"/>
+              <w:right w:w="120" w:type="dxa"/>
             </w:tcMar>
           </w:tcPr>
           <w:p>
@@ -2375,10 +1696,10 @@
             </w:pPr>
             <w:r>
               <w:rPr>
-                <w:rFonts w:ascii="Consolas" w:hAnsi="Consolas"/>
+                <w:rFonts w:ascii="Times New Roman" w:hAnsi="Times New Roman"/>
                 <w:b/>
-                <w:color w:val="0969DA"/>
-                <w:sz w:val="19"/>
+                <w:color w:val="000000"/>
+                <w:sz w:val="24"/>
               </w:rPr>
               <w:t>git add .</w:t>
             </w:r>
@@ -2387,12 +1708,11 @@
         <w:tc>
           <w:tcPr>
             <w:tcW w:type="dxa" w:w="3168"/>
-            <w:shd w:fill="F9FAFB"/>
             <w:tcMar>
-              <w:top w:w="100" w:type="dxa"/>
-              <w:bottom w:w="100" w:type="dxa"/>
-              <w:left w:w="140" w:type="dxa"/>
-              <w:right w:w="140" w:type="dxa"/>
+              <w:top w:w="80" w:type="dxa"/>
+              <w:bottom w:w="80" w:type="dxa"/>
+              <w:left w:w="120" w:type="dxa"/>
+              <w:right w:w="120" w:type="dxa"/>
             </w:tcMar>
           </w:tcPr>
           <w:p>
@@ -2401,23 +1721,22 @@
             </w:pPr>
             <w:r>
               <w:rPr>
-                <w:rFonts w:ascii="Arial" w:hAnsi="Arial"/>
-                <w:color w:val="333333"/>
-                <w:sz w:val="19"/>
+                <w:rFonts w:ascii="Times New Roman" w:hAnsi="Times New Roman"/>
+                <w:color w:val="000000"/>
+                <w:sz w:val="24"/>
               </w:rPr>
-              <w:t>Đưa tất cả file vào Staging</w:t>
+              <w:t>Chuẩn bị commit</w:t>
             </w:r>
           </w:p>
         </w:tc>
         <w:tc>
           <w:tcPr>
             <w:tcW w:type="dxa" w:w="2592"/>
-            <w:shd w:fill="F9FAFB"/>
             <w:tcMar>
-              <w:top w:w="100" w:type="dxa"/>
-              <w:bottom w:w="100" w:type="dxa"/>
-              <w:left w:w="140" w:type="dxa"/>
-              <w:right w:w="140" w:type="dxa"/>
+              <w:top w:w="80" w:type="dxa"/>
+              <w:bottom w:w="80" w:type="dxa"/>
+              <w:left w:w="120" w:type="dxa"/>
+              <w:right w:w="120" w:type="dxa"/>
             </w:tcMar>
           </w:tcPr>
           <w:p>
@@ -2426,11 +1745,11 @@
             </w:pPr>
             <w:r>
               <w:rPr>
-                <w:rFonts w:ascii="Arial" w:hAnsi="Arial"/>
-                <w:color w:val="333333"/>
-                <w:sz w:val="19"/>
+                <w:rFonts w:ascii="Times New Roman" w:hAnsi="Times New Roman"/>
+                <w:color w:val="000000"/>
+                <w:sz w:val="24"/>
               </w:rPr>
-              <w:t>Chuẩn bị commit toàn bộ thay đổi vừa code</w:t>
+              <w:t>Thêm mọi file vừa sửa vào staging</w:t>
             </w:r>
           </w:p>
         </w:tc>
@@ -2440,10 +1759,10 @@
           <w:tcPr>
             <w:tcW w:type="dxa" w:w="720"/>
             <w:tcMar>
-              <w:top w:w="100" w:type="dxa"/>
-              <w:bottom w:w="100" w:type="dxa"/>
-              <w:left w:w="140" w:type="dxa"/>
-              <w:right w:w="140" w:type="dxa"/>
+              <w:top w:w="80" w:type="dxa"/>
+              <w:bottom w:w="80" w:type="dxa"/>
+              <w:left w:w="120" w:type="dxa"/>
+              <w:right w:w="120" w:type="dxa"/>
             </w:tcMar>
           </w:tcPr>
           <w:p>
@@ -2453,9 +1772,9 @@
             </w:pPr>
             <w:r>
               <w:rPr>
-                <w:rFonts w:ascii="Arial" w:hAnsi="Arial"/>
-                <w:color w:val="333333"/>
-                <w:sz w:val="19"/>
+                <w:rFonts w:ascii="Times New Roman" w:hAnsi="Times New Roman"/>
+                <w:color w:val="000000"/>
+                <w:sz w:val="24"/>
               </w:rPr>
               <w:t>5</w:t>
             </w:r>
@@ -2465,10 +1784,10 @@
           <w:tcPr>
             <w:tcW w:type="dxa" w:w="2880"/>
             <w:tcMar>
-              <w:top w:w="100" w:type="dxa"/>
-              <w:bottom w:w="100" w:type="dxa"/>
-              <w:left w:w="140" w:type="dxa"/>
-              <w:right w:w="140" w:type="dxa"/>
+              <w:top w:w="80" w:type="dxa"/>
+              <w:bottom w:w="80" w:type="dxa"/>
+              <w:left w:w="120" w:type="dxa"/>
+              <w:right w:w="120" w:type="dxa"/>
             </w:tcMar>
           </w:tcPr>
           <w:p>
@@ -2477,10 +1796,10 @@
             </w:pPr>
             <w:r>
               <w:rPr>
-                <w:rFonts w:ascii="Consolas" w:hAnsi="Consolas"/>
+                <w:rFonts w:ascii="Times New Roman" w:hAnsi="Times New Roman"/>
                 <w:b/>
-                <w:color w:val="0969DA"/>
-                <w:sz w:val="19"/>
+                <w:color w:val="000000"/>
+                <w:sz w:val="24"/>
               </w:rPr>
               <w:t>git commit -m "msg"</w:t>
             </w:r>
@@ -2490,10 +1809,10 @@
           <w:tcPr>
             <w:tcW w:type="dxa" w:w="3168"/>
             <w:tcMar>
-              <w:top w:w="100" w:type="dxa"/>
-              <w:bottom w:w="100" w:type="dxa"/>
-              <w:left w:w="140" w:type="dxa"/>
-              <w:right w:w="140" w:type="dxa"/>
+              <w:top w:w="80" w:type="dxa"/>
+              <w:bottom w:w="80" w:type="dxa"/>
+              <w:left w:w="120" w:type="dxa"/>
+              <w:right w:w="120" w:type="dxa"/>
             </w:tcMar>
           </w:tcPr>
           <w:p>
@@ -2502,11 +1821,11 @@
             </w:pPr>
             <w:r>
               <w:rPr>
-                <w:rFonts w:ascii="Arial" w:hAnsi="Arial"/>
-                <w:color w:val="333333"/>
-                <w:sz w:val="19"/>
+                <w:rFonts w:ascii="Times New Roman" w:hAnsi="Times New Roman"/>
+                <w:color w:val="000000"/>
+                <w:sz w:val="24"/>
               </w:rPr>
-              <w:t>Lưu snapshot phiên bản</w:t>
+              <w:t>Lưu cột mốc code</w:t>
             </w:r>
           </w:p>
         </w:tc>
@@ -2514,10 +1833,10 @@
           <w:tcPr>
             <w:tcW w:type="dxa" w:w="2592"/>
             <w:tcMar>
-              <w:top w:w="100" w:type="dxa"/>
-              <w:bottom w:w="100" w:type="dxa"/>
-              <w:left w:w="140" w:type="dxa"/>
-              <w:right w:w="140" w:type="dxa"/>
+              <w:top w:w="80" w:type="dxa"/>
+              <w:bottom w:w="80" w:type="dxa"/>
+              <w:left w:w="120" w:type="dxa"/>
+              <w:right w:w="120" w:type="dxa"/>
             </w:tcMar>
           </w:tcPr>
           <w:p>
@@ -2526,11 +1845,11 @@
             </w:pPr>
             <w:r>
               <w:rPr>
-                <w:rFonts w:ascii="Arial" w:hAnsi="Arial"/>
-                <w:color w:val="333333"/>
-                <w:sz w:val="19"/>
+                <w:rFonts w:ascii="Times New Roman" w:hAnsi="Times New Roman"/>
+                <w:color w:val="000000"/>
+                <w:sz w:val="24"/>
               </w:rPr>
-              <w:t>Lưu lại cột mốc kèm lời mô tả công việc</w:t>
+              <w:t>Chốt phiên bản kèm mô tả</w:t>
             </w:r>
           </w:p>
         </w:tc>
@@ -2539,12 +1858,11 @@
         <w:tc>
           <w:tcPr>
             <w:tcW w:type="dxa" w:w="720"/>
-            <w:shd w:fill="F9FAFB"/>
             <w:tcMar>
-              <w:top w:w="100" w:type="dxa"/>
-              <w:bottom w:w="100" w:type="dxa"/>
-              <w:left w:w="140" w:type="dxa"/>
-              <w:right w:w="140" w:type="dxa"/>
+              <w:top w:w="80" w:type="dxa"/>
+              <w:bottom w:w="80" w:type="dxa"/>
+              <w:left w:w="120" w:type="dxa"/>
+              <w:right w:w="120" w:type="dxa"/>
             </w:tcMar>
           </w:tcPr>
           <w:p>
@@ -2554,9 +1872,9 @@
             </w:pPr>
             <w:r>
               <w:rPr>
-                <w:rFonts w:ascii="Arial" w:hAnsi="Arial"/>
-                <w:color w:val="333333"/>
-                <w:sz w:val="19"/>
+                <w:rFonts w:ascii="Times New Roman" w:hAnsi="Times New Roman"/>
+                <w:color w:val="000000"/>
+                <w:sz w:val="24"/>
               </w:rPr>
               <w:t>6</w:t>
             </w:r>
@@ -2565,12 +1883,11 @@
         <w:tc>
           <w:tcPr>
             <w:tcW w:type="dxa" w:w="2880"/>
-            <w:shd w:fill="F9FAFB"/>
             <w:tcMar>
-              <w:top w:w="100" w:type="dxa"/>
-              <w:bottom w:w="100" w:type="dxa"/>
-              <w:left w:w="140" w:type="dxa"/>
-              <w:right w:w="140" w:type="dxa"/>
+              <w:top w:w="80" w:type="dxa"/>
+              <w:bottom w:w="80" w:type="dxa"/>
+              <w:left w:w="120" w:type="dxa"/>
+              <w:right w:w="120" w:type="dxa"/>
             </w:tcMar>
           </w:tcPr>
           <w:p>
@@ -2579,24 +1896,23 @@
             </w:pPr>
             <w:r>
               <w:rPr>
-                <w:rFonts w:ascii="Consolas" w:hAnsi="Consolas"/>
+                <w:rFonts w:ascii="Times New Roman" w:hAnsi="Times New Roman"/>
                 <w:b/>
-                <w:color w:val="0969DA"/>
-                <w:sz w:val="19"/>
+                <w:color w:val="000000"/>
+                <w:sz w:val="24"/>
               </w:rPr>
-              <w:t>git log --oneline</w:t>
+              <w:t>git branch</w:t>
             </w:r>
           </w:p>
         </w:tc>
         <w:tc>
           <w:tcPr>
             <w:tcW w:type="dxa" w:w="3168"/>
-            <w:shd w:fill="F9FAFB"/>
             <w:tcMar>
-              <w:top w:w="100" w:type="dxa"/>
-              <w:bottom w:w="100" w:type="dxa"/>
-              <w:left w:w="140" w:type="dxa"/>
-              <w:right w:w="140" w:type="dxa"/>
+              <w:top w:w="80" w:type="dxa"/>
+              <w:bottom w:w="80" w:type="dxa"/>
+              <w:left w:w="120" w:type="dxa"/>
+              <w:right w:w="120" w:type="dxa"/>
             </w:tcMar>
           </w:tcPr>
           <w:p>
@@ -2605,23 +1921,22 @@
             </w:pPr>
             <w:r>
               <w:rPr>
-                <w:rFonts w:ascii="Arial" w:hAnsi="Arial"/>
-                <w:color w:val="333333"/>
-                <w:sz w:val="19"/>
+                <w:rFonts w:ascii="Times New Roman" w:hAnsi="Times New Roman"/>
+                <w:color w:val="000000"/>
+                <w:sz w:val="24"/>
               </w:rPr>
-              <w:t>Xem vắn tắt lịch sử</w:t>
+              <w:t>Xem danh sách nhánh</w:t>
             </w:r>
           </w:p>
         </w:tc>
         <w:tc>
           <w:tcPr>
             <w:tcW w:type="dxa" w:w="2592"/>
-            <w:shd w:fill="F9FAFB"/>
             <w:tcMar>
-              <w:top w:w="100" w:type="dxa"/>
-              <w:bottom w:w="100" w:type="dxa"/>
-              <w:left w:w="140" w:type="dxa"/>
-              <w:right w:w="140" w:type="dxa"/>
+              <w:top w:w="80" w:type="dxa"/>
+              <w:bottom w:w="80" w:type="dxa"/>
+              <w:left w:w="120" w:type="dxa"/>
+              <w:right w:w="120" w:type="dxa"/>
             </w:tcMar>
           </w:tcPr>
           <w:p>
@@ -2630,11 +1945,11 @@
             </w:pPr>
             <w:r>
               <w:rPr>
-                <w:rFonts w:ascii="Arial" w:hAnsi="Arial"/>
-                <w:color w:val="333333"/>
-                <w:sz w:val="19"/>
+                <w:rFonts w:ascii="Times New Roman" w:hAnsi="Times New Roman"/>
+                <w:color w:val="000000"/>
+                <w:sz w:val="24"/>
               </w:rPr>
-              <w:t>Kiểm tra các commit gần nhất trong dự án</w:t>
+              <w:t>Biết đang đứng ở nhánh nào</w:t>
             </w:r>
           </w:p>
         </w:tc>
@@ -2644,10 +1959,10 @@
           <w:tcPr>
             <w:tcW w:type="dxa" w:w="720"/>
             <w:tcMar>
-              <w:top w:w="100" w:type="dxa"/>
-              <w:bottom w:w="100" w:type="dxa"/>
-              <w:left w:w="140" w:type="dxa"/>
-              <w:right w:w="140" w:type="dxa"/>
+              <w:top w:w="80" w:type="dxa"/>
+              <w:bottom w:w="80" w:type="dxa"/>
+              <w:left w:w="120" w:type="dxa"/>
+              <w:right w:w="120" w:type="dxa"/>
             </w:tcMar>
           </w:tcPr>
           <w:p>
@@ -2657,9 +1972,9 @@
             </w:pPr>
             <w:r>
               <w:rPr>
-                <w:rFonts w:ascii="Arial" w:hAnsi="Arial"/>
-                <w:color w:val="333333"/>
-                <w:sz w:val="19"/>
+                <w:rFonts w:ascii="Times New Roman" w:hAnsi="Times New Roman"/>
+                <w:color w:val="000000"/>
+                <w:sz w:val="24"/>
               </w:rPr>
               <w:t>7</w:t>
             </w:r>
@@ -2669,10 +1984,10 @@
           <w:tcPr>
             <w:tcW w:type="dxa" w:w="2880"/>
             <w:tcMar>
-              <w:top w:w="100" w:type="dxa"/>
-              <w:bottom w:w="100" w:type="dxa"/>
-              <w:left w:w="140" w:type="dxa"/>
-              <w:right w:w="140" w:type="dxa"/>
+              <w:top w:w="80" w:type="dxa"/>
+              <w:bottom w:w="80" w:type="dxa"/>
+              <w:left w:w="120" w:type="dxa"/>
+              <w:right w:w="120" w:type="dxa"/>
             </w:tcMar>
           </w:tcPr>
           <w:p>
@@ -2681,12 +1996,12 @@
             </w:pPr>
             <w:r>
               <w:rPr>
-                <w:rFonts w:ascii="Consolas" w:hAnsi="Consolas"/>
+                <w:rFonts w:ascii="Times New Roman" w:hAnsi="Times New Roman"/>
                 <w:b/>
-                <w:color w:val="0969DA"/>
-                <w:sz w:val="19"/>
+                <w:color w:val="000000"/>
+                <w:sz w:val="24"/>
               </w:rPr>
-              <w:t>git branch</w:t>
+              <w:t>git checkout -b &lt;name&gt;</w:t>
             </w:r>
           </w:p>
         </w:tc>
@@ -2694,10 +2009,10 @@
           <w:tcPr>
             <w:tcW w:type="dxa" w:w="3168"/>
             <w:tcMar>
-              <w:top w:w="100" w:type="dxa"/>
-              <w:bottom w:w="100" w:type="dxa"/>
-              <w:left w:w="140" w:type="dxa"/>
-              <w:right w:w="140" w:type="dxa"/>
+              <w:top w:w="80" w:type="dxa"/>
+              <w:bottom w:w="80" w:type="dxa"/>
+              <w:left w:w="120" w:type="dxa"/>
+              <w:right w:w="120" w:type="dxa"/>
             </w:tcMar>
           </w:tcPr>
           <w:p>
@@ -2706,11 +2021,11 @@
             </w:pPr>
             <w:r>
               <w:rPr>
-                <w:rFonts w:ascii="Arial" w:hAnsi="Arial"/>
-                <w:color w:val="333333"/>
-                <w:sz w:val="19"/>
+                <w:rFonts w:ascii="Times New Roman" w:hAnsi="Times New Roman"/>
+                <w:color w:val="000000"/>
+                <w:sz w:val="24"/>
               </w:rPr>
-              <w:t>Xem danh sách các nhánh</w:t>
+              <w:t>Tạo &amp; đổi nhánh mới</w:t>
             </w:r>
           </w:p>
         </w:tc>
@@ -2718,10 +2033,10 @@
           <w:tcPr>
             <w:tcW w:type="dxa" w:w="2592"/>
             <w:tcMar>
-              <w:top w:w="100" w:type="dxa"/>
-              <w:bottom w:w="100" w:type="dxa"/>
-              <w:left w:w="140" w:type="dxa"/>
-              <w:right w:w="140" w:type="dxa"/>
+              <w:top w:w="80" w:type="dxa"/>
+              <w:bottom w:w="80" w:type="dxa"/>
+              <w:left w:w="120" w:type="dxa"/>
+              <w:right w:w="120" w:type="dxa"/>
             </w:tcMar>
           </w:tcPr>
           <w:p>
@@ -2730,11 +2045,11 @@
             </w:pPr>
             <w:r>
               <w:rPr>
-                <w:rFonts w:ascii="Arial" w:hAnsi="Arial"/>
-                <w:color w:val="333333"/>
-                <w:sz w:val="19"/>
+                <w:rFonts w:ascii="Times New Roman" w:hAnsi="Times New Roman"/>
+                <w:color w:val="000000"/>
+                <w:sz w:val="24"/>
               </w:rPr>
-              <w:t>Biết đang làm việc trên nhánh nào</w:t>
+              <w:t>Làm tính năng mới độc lập</w:t>
             </w:r>
           </w:p>
         </w:tc>
@@ -2743,12 +2058,11 @@
         <w:tc>
           <w:tcPr>
             <w:tcW w:type="dxa" w:w="720"/>
-            <w:shd w:fill="F9FAFB"/>
             <w:tcMar>
-              <w:top w:w="100" w:type="dxa"/>
-              <w:bottom w:w="100" w:type="dxa"/>
-              <w:left w:w="140" w:type="dxa"/>
-              <w:right w:w="140" w:type="dxa"/>
+              <w:top w:w="80" w:type="dxa"/>
+              <w:bottom w:w="80" w:type="dxa"/>
+              <w:left w:w="120" w:type="dxa"/>
+              <w:right w:w="120" w:type="dxa"/>
             </w:tcMar>
           </w:tcPr>
           <w:p>
@@ -2758,9 +2072,9 @@
             </w:pPr>
             <w:r>
               <w:rPr>
-                <w:rFonts w:ascii="Arial" w:hAnsi="Arial"/>
-                <w:color w:val="333333"/>
-                <w:sz w:val="19"/>
+                <w:rFonts w:ascii="Times New Roman" w:hAnsi="Times New Roman"/>
+                <w:color w:val="000000"/>
+                <w:sz w:val="24"/>
               </w:rPr>
               <w:t>8</w:t>
             </w:r>
@@ -2769,12 +2083,11 @@
         <w:tc>
           <w:tcPr>
             <w:tcW w:type="dxa" w:w="2880"/>
-            <w:shd w:fill="F9FAFB"/>
             <w:tcMar>
-              <w:top w:w="100" w:type="dxa"/>
-              <w:bottom w:w="100" w:type="dxa"/>
-              <w:left w:w="140" w:type="dxa"/>
-              <w:right w:w="140" w:type="dxa"/>
+              <w:top w:w="80" w:type="dxa"/>
+              <w:bottom w:w="80" w:type="dxa"/>
+              <w:left w:w="120" w:type="dxa"/>
+              <w:right w:w="120" w:type="dxa"/>
             </w:tcMar>
           </w:tcPr>
           <w:p>
@@ -2783,24 +2096,23 @@
             </w:pPr>
             <w:r>
               <w:rPr>
-                <w:rFonts w:ascii="Consolas" w:hAnsi="Consolas"/>
+                <w:rFonts w:ascii="Times New Roman" w:hAnsi="Times New Roman"/>
                 <w:b/>
-                <w:color w:val="0969DA"/>
-                <w:sz w:val="19"/>
+                <w:color w:val="000000"/>
+                <w:sz w:val="24"/>
               </w:rPr>
-              <w:t>git checkout -b &lt;name&gt;</w:t>
+              <w:t>git merge &lt;name&gt;</w:t>
             </w:r>
           </w:p>
         </w:tc>
         <w:tc>
           <w:tcPr>
             <w:tcW w:type="dxa" w:w="3168"/>
-            <w:shd w:fill="F9FAFB"/>
             <w:tcMar>
-              <w:top w:w="100" w:type="dxa"/>
-              <w:bottom w:w="100" w:type="dxa"/>
-              <w:left w:w="140" w:type="dxa"/>
-              <w:right w:w="140" w:type="dxa"/>
+              <w:top w:w="80" w:type="dxa"/>
+              <w:bottom w:w="80" w:type="dxa"/>
+              <w:left w:w="120" w:type="dxa"/>
+              <w:right w:w="120" w:type="dxa"/>
             </w:tcMar>
           </w:tcPr>
           <w:p>
@@ -2809,23 +2121,22 @@
             </w:pPr>
             <w:r>
               <w:rPr>
-                <w:rFonts w:ascii="Arial" w:hAnsi="Arial"/>
-                <w:color w:val="333333"/>
-                <w:sz w:val="19"/>
+                <w:rFonts w:ascii="Times New Roman" w:hAnsi="Times New Roman"/>
+                <w:color w:val="000000"/>
+                <w:sz w:val="24"/>
               </w:rPr>
-              <w:t>Tạo &amp; chuyển sang nhánh mới</w:t>
+              <w:t>Gộp nhánh</w:t>
             </w:r>
           </w:p>
         </w:tc>
         <w:tc>
           <w:tcPr>
             <w:tcW w:type="dxa" w:w="2592"/>
-            <w:shd w:fill="F9FAFB"/>
             <w:tcMar>
-              <w:top w:w="100" w:type="dxa"/>
-              <w:bottom w:w="100" w:type="dxa"/>
-              <w:left w:w="140" w:type="dxa"/>
-              <w:right w:w="140" w:type="dxa"/>
+              <w:top w:w="80" w:type="dxa"/>
+              <w:bottom w:w="80" w:type="dxa"/>
+              <w:left w:w="120" w:type="dxa"/>
+              <w:right w:w="120" w:type="dxa"/>
             </w:tcMar>
           </w:tcPr>
           <w:p>
@@ -2834,11 +2145,11 @@
             </w:pPr>
             <w:r>
               <w:rPr>
-                <w:rFonts w:ascii="Arial" w:hAnsi="Arial"/>
-                <w:color w:val="333333"/>
-                <w:sz w:val="19"/>
+                <w:rFonts w:ascii="Times New Roman" w:hAnsi="Times New Roman"/>
+                <w:color w:val="000000"/>
+                <w:sz w:val="24"/>
               </w:rPr>
-              <w:t>Bắt đầu lập trình một tính năng độc lập</w:t>
+              <w:t>Hòa nhánh tính năng vào main</w:t>
             </w:r>
           </w:p>
         </w:tc>
@@ -2848,10 +2159,10 @@
           <w:tcPr>
             <w:tcW w:type="dxa" w:w="720"/>
             <w:tcMar>
-              <w:top w:w="100" w:type="dxa"/>
-              <w:bottom w:w="100" w:type="dxa"/>
-              <w:left w:w="140" w:type="dxa"/>
-              <w:right w:w="140" w:type="dxa"/>
+              <w:top w:w="80" w:type="dxa"/>
+              <w:bottom w:w="80" w:type="dxa"/>
+              <w:left w:w="120" w:type="dxa"/>
+              <w:right w:w="120" w:type="dxa"/>
             </w:tcMar>
           </w:tcPr>
           <w:p>
@@ -2861,9 +2172,9 @@
             </w:pPr>
             <w:r>
               <w:rPr>
-                <w:rFonts w:ascii="Arial" w:hAnsi="Arial"/>
-                <w:color w:val="333333"/>
-                <w:sz w:val="19"/>
+                <w:rFonts w:ascii="Times New Roman" w:hAnsi="Times New Roman"/>
+                <w:color w:val="000000"/>
+                <w:sz w:val="24"/>
               </w:rPr>
               <w:t>9</w:t>
             </w:r>
@@ -2873,10 +2184,10 @@
           <w:tcPr>
             <w:tcW w:type="dxa" w:w="2880"/>
             <w:tcMar>
-              <w:top w:w="100" w:type="dxa"/>
-              <w:bottom w:w="100" w:type="dxa"/>
-              <w:left w:w="140" w:type="dxa"/>
-              <w:right w:w="140" w:type="dxa"/>
+              <w:top w:w="80" w:type="dxa"/>
+              <w:bottom w:w="80" w:type="dxa"/>
+              <w:left w:w="120" w:type="dxa"/>
+              <w:right w:w="120" w:type="dxa"/>
             </w:tcMar>
           </w:tcPr>
           <w:p>
@@ -2885,12 +2196,12 @@
             </w:pPr>
             <w:r>
               <w:rPr>
-                <w:rFonts w:ascii="Consolas" w:hAnsi="Consolas"/>
+                <w:rFonts w:ascii="Times New Roman" w:hAnsi="Times New Roman"/>
                 <w:b/>
-                <w:color w:val="0969DA"/>
-                <w:sz w:val="19"/>
+                <w:color w:val="000000"/>
+                <w:sz w:val="24"/>
               </w:rPr>
-              <w:t>git merge &lt;name&gt;</w:t>
+              <w:t>git push -u origin &lt;br&gt;</w:t>
             </w:r>
           </w:p>
         </w:tc>
@@ -2898,10 +2209,10 @@
           <w:tcPr>
             <w:tcW w:type="dxa" w:w="3168"/>
             <w:tcMar>
-              <w:top w:w="100" w:type="dxa"/>
-              <w:bottom w:w="100" w:type="dxa"/>
-              <w:left w:w="140" w:type="dxa"/>
-              <w:right w:w="140" w:type="dxa"/>
+              <w:top w:w="80" w:type="dxa"/>
+              <w:bottom w:w="80" w:type="dxa"/>
+              <w:left w:w="120" w:type="dxa"/>
+              <w:right w:w="120" w:type="dxa"/>
             </w:tcMar>
           </w:tcPr>
           <w:p>
@@ -2910,11 +2221,11 @@
             </w:pPr>
             <w:r>
               <w:rPr>
-                <w:rFonts w:ascii="Arial" w:hAnsi="Arial"/>
-                <w:color w:val="333333"/>
-                <w:sz w:val="19"/>
+                <w:rFonts w:ascii="Times New Roman" w:hAnsi="Times New Roman"/>
+                <w:color w:val="000000"/>
+                <w:sz w:val="24"/>
               </w:rPr>
-              <w:t>Hòa nhập mã nguồn 2 nhánh</w:t>
+              <w:t>Đẩy code lên mạng</w:t>
             </w:r>
           </w:p>
         </w:tc>
@@ -2922,10 +2233,10 @@
           <w:tcPr>
             <w:tcW w:type="dxa" w:w="2592"/>
             <w:tcMar>
-              <w:top w:w="100" w:type="dxa"/>
-              <w:bottom w:w="100" w:type="dxa"/>
-              <w:left w:w="140" w:type="dxa"/>
-              <w:right w:w="140" w:type="dxa"/>
+              <w:top w:w="80" w:type="dxa"/>
+              <w:bottom w:w="80" w:type="dxa"/>
+              <w:left w:w="120" w:type="dxa"/>
+              <w:right w:w="120" w:type="dxa"/>
             </w:tcMar>
           </w:tcPr>
           <w:p>
@@ -2934,11 +2245,11 @@
             </w:pPr>
             <w:r>
               <w:rPr>
-                <w:rFonts w:ascii="Arial" w:hAnsi="Arial"/>
-                <w:color w:val="333333"/>
-                <w:sz w:val="19"/>
+                <w:rFonts w:ascii="Times New Roman" w:hAnsi="Times New Roman"/>
+                <w:color w:val="000000"/>
+                <w:sz w:val="24"/>
               </w:rPr>
-              <w:t>Gộp tính năng đã hoàn thiện vào nhánh chính</w:t>
+              <w:t>Đưa bài làm lên GitHub</w:t>
             </w:r>
           </w:p>
         </w:tc>
@@ -2947,12 +2258,11 @@
         <w:tc>
           <w:tcPr>
             <w:tcW w:type="dxa" w:w="720"/>
-            <w:shd w:fill="F9FAFB"/>
             <w:tcMar>
-              <w:top w:w="100" w:type="dxa"/>
-              <w:bottom w:w="100" w:type="dxa"/>
-              <w:left w:w="140" w:type="dxa"/>
-              <w:right w:w="140" w:type="dxa"/>
+              <w:top w:w="80" w:type="dxa"/>
+              <w:bottom w:w="80" w:type="dxa"/>
+              <w:left w:w="120" w:type="dxa"/>
+              <w:right w:w="120" w:type="dxa"/>
             </w:tcMar>
           </w:tcPr>
           <w:p>
@@ -2962,9 +2272,9 @@
             </w:pPr>
             <w:r>
               <w:rPr>
-                <w:rFonts w:ascii="Arial" w:hAnsi="Arial"/>
-                <w:color w:val="333333"/>
-                <w:sz w:val="19"/>
+                <w:rFonts w:ascii="Times New Roman" w:hAnsi="Times New Roman"/>
+                <w:color w:val="000000"/>
+                <w:sz w:val="24"/>
               </w:rPr>
               <w:t>10</w:t>
             </w:r>
@@ -2973,12 +2283,11 @@
         <w:tc>
           <w:tcPr>
             <w:tcW w:type="dxa" w:w="2880"/>
-            <w:shd w:fill="F9FAFB"/>
             <w:tcMar>
-              <w:top w:w="100" w:type="dxa"/>
-              <w:bottom w:w="100" w:type="dxa"/>
-              <w:left w:w="140" w:type="dxa"/>
-              <w:right w:w="140" w:type="dxa"/>
+              <w:top w:w="80" w:type="dxa"/>
+              <w:bottom w:w="80" w:type="dxa"/>
+              <w:left w:w="120" w:type="dxa"/>
+              <w:right w:w="120" w:type="dxa"/>
             </w:tcMar>
           </w:tcPr>
           <w:p>
@@ -2987,24 +2296,23 @@
             </w:pPr>
             <w:r>
               <w:rPr>
-                <w:rFonts w:ascii="Consolas" w:hAnsi="Consolas"/>
+                <w:rFonts w:ascii="Times New Roman" w:hAnsi="Times New Roman"/>
                 <w:b/>
-                <w:color w:val="0969DA"/>
-                <w:sz w:val="19"/>
+                <w:color w:val="000000"/>
+                <w:sz w:val="24"/>
               </w:rPr>
-              <w:t>git remote add origin &lt;url&gt;</w:t>
+              <w:t>git pull</w:t>
             </w:r>
           </w:p>
         </w:tc>
         <w:tc>
           <w:tcPr>
             <w:tcW w:type="dxa" w:w="3168"/>
-            <w:shd w:fill="F9FAFB"/>
             <w:tcMar>
-              <w:top w:w="100" w:type="dxa"/>
-              <w:bottom w:w="100" w:type="dxa"/>
-              <w:left w:w="140" w:type="dxa"/>
-              <w:right w:w="140" w:type="dxa"/>
+              <w:top w:w="80" w:type="dxa"/>
+              <w:bottom w:w="80" w:type="dxa"/>
+              <w:left w:w="120" w:type="dxa"/>
+              <w:right w:w="120" w:type="dxa"/>
             </w:tcMar>
           </w:tcPr>
           <w:p>
@@ -3013,23 +2321,22 @@
             </w:pPr>
             <w:r>
               <w:rPr>
-                <w:rFonts w:ascii="Arial" w:hAnsi="Arial"/>
-                <w:color w:val="333333"/>
-                <w:sz w:val="19"/>
+                <w:rFonts w:ascii="Times New Roman" w:hAnsi="Times New Roman"/>
+                <w:color w:val="000000"/>
+                <w:sz w:val="24"/>
               </w:rPr>
-              <w:t>Liên kết với GitHub</w:t>
+              <w:t>Kéo code mới về</w:t>
             </w:r>
           </w:p>
         </w:tc>
         <w:tc>
           <w:tcPr>
             <w:tcW w:type="dxa" w:w="2592"/>
-            <w:shd w:fill="F9FAFB"/>
             <w:tcMar>
-              <w:top w:w="100" w:type="dxa"/>
-              <w:bottom w:w="100" w:type="dxa"/>
-              <w:left w:w="140" w:type="dxa"/>
-              <w:right w:w="140" w:type="dxa"/>
+              <w:top w:w="80" w:type="dxa"/>
+              <w:bottom w:w="80" w:type="dxa"/>
+              <w:left w:w="120" w:type="dxa"/>
+              <w:right w:w="120" w:type="dxa"/>
             </w:tcMar>
           </w:tcPr>
           <w:p>
@@ -3038,11 +2345,11 @@
             </w:pPr>
             <w:r>
               <w:rPr>
-                <w:rFonts w:ascii="Arial" w:hAnsi="Arial"/>
-                <w:color w:val="333333"/>
-                <w:sz w:val="19"/>
+                <w:rFonts w:ascii="Times New Roman" w:hAnsi="Times New Roman"/>
+                <w:color w:val="000000"/>
+                <w:sz w:val="24"/>
               </w:rPr>
-              <w:t>Kết nối thư mục local với repo trên đám mây</w:t>
+              <w:t>Cập nhật code mới từ nhóm</w:t>
             </w:r>
           </w:p>
         </w:tc>
@@ -3052,10 +2359,10 @@
           <w:tcPr>
             <w:tcW w:type="dxa" w:w="720"/>
             <w:tcMar>
-              <w:top w:w="100" w:type="dxa"/>
-              <w:bottom w:w="100" w:type="dxa"/>
-              <w:left w:w="140" w:type="dxa"/>
-              <w:right w:w="140" w:type="dxa"/>
+              <w:top w:w="80" w:type="dxa"/>
+              <w:bottom w:w="80" w:type="dxa"/>
+              <w:left w:w="120" w:type="dxa"/>
+              <w:right w:w="120" w:type="dxa"/>
             </w:tcMar>
           </w:tcPr>
           <w:p>
@@ -3065,9 +2372,9 @@
             </w:pPr>
             <w:r>
               <w:rPr>
-                <w:rFonts w:ascii="Arial" w:hAnsi="Arial"/>
-                <w:color w:val="333333"/>
-                <w:sz w:val="19"/>
+                <w:rFonts w:ascii="Times New Roman" w:hAnsi="Times New Roman"/>
+                <w:color w:val="000000"/>
+                <w:sz w:val="24"/>
               </w:rPr>
               <w:t>11</w:t>
             </w:r>
@@ -3077,10 +2384,10 @@
           <w:tcPr>
             <w:tcW w:type="dxa" w:w="2880"/>
             <w:tcMar>
-              <w:top w:w="100" w:type="dxa"/>
-              <w:bottom w:w="100" w:type="dxa"/>
-              <w:left w:w="140" w:type="dxa"/>
-              <w:right w:w="140" w:type="dxa"/>
+              <w:top w:w="80" w:type="dxa"/>
+              <w:bottom w:w="80" w:type="dxa"/>
+              <w:left w:w="120" w:type="dxa"/>
+              <w:right w:w="120" w:type="dxa"/>
             </w:tcMar>
           </w:tcPr>
           <w:p>
@@ -3089,12 +2396,12 @@
             </w:pPr>
             <w:r>
               <w:rPr>
-                <w:rFonts w:ascii="Consolas" w:hAnsi="Consolas"/>
+                <w:rFonts w:ascii="Times New Roman" w:hAnsi="Times New Roman"/>
                 <w:b/>
-                <w:color w:val="0969DA"/>
-                <w:sz w:val="19"/>
+                <w:color w:val="000000"/>
+                <w:sz w:val="24"/>
               </w:rPr>
-              <w:t>git push -u origin &lt;branch&gt;</w:t>
+              <w:t>git stash</w:t>
             </w:r>
           </w:p>
         </w:tc>
@@ -3102,10 +2409,10 @@
           <w:tcPr>
             <w:tcW w:type="dxa" w:w="3168"/>
             <w:tcMar>
-              <w:top w:w="100" w:type="dxa"/>
-              <w:bottom w:w="100" w:type="dxa"/>
-              <w:left w:w="140" w:type="dxa"/>
-              <w:right w:w="140" w:type="dxa"/>
+              <w:top w:w="80" w:type="dxa"/>
+              <w:bottom w:w="80" w:type="dxa"/>
+              <w:left w:w="120" w:type="dxa"/>
+              <w:right w:w="120" w:type="dxa"/>
             </w:tcMar>
           </w:tcPr>
           <w:p>
@@ -3114,11 +2421,11 @@
             </w:pPr>
             <w:r>
               <w:rPr>
-                <w:rFonts w:ascii="Arial" w:hAnsi="Arial"/>
-                <w:color w:val="333333"/>
-                <w:sz w:val="19"/>
+                <w:rFonts w:ascii="Times New Roman" w:hAnsi="Times New Roman"/>
+                <w:color w:val="000000"/>
+                <w:sz w:val="24"/>
               </w:rPr>
-              <w:t>Đẩy code lên GitHub</w:t>
+              <w:t>Cất tạm code dở</w:t>
             </w:r>
           </w:p>
         </w:tc>
@@ -3126,10 +2433,10 @@
           <w:tcPr>
             <w:tcW w:type="dxa" w:w="2592"/>
             <w:tcMar>
-              <w:top w:w="100" w:type="dxa"/>
-              <w:bottom w:w="100" w:type="dxa"/>
-              <w:left w:w="140" w:type="dxa"/>
-              <w:right w:w="140" w:type="dxa"/>
+              <w:top w:w="80" w:type="dxa"/>
+              <w:bottom w:w="80" w:type="dxa"/>
+              <w:left w:w="120" w:type="dxa"/>
+              <w:right w:w="120" w:type="dxa"/>
             </w:tcMar>
           </w:tcPr>
           <w:p>
@@ -3138,11 +2445,11 @@
             </w:pPr>
             <w:r>
               <w:rPr>
-                <w:rFonts w:ascii="Arial" w:hAnsi="Arial"/>
-                <w:color w:val="333333"/>
-                <w:sz w:val="19"/>
+                <w:rFonts w:ascii="Times New Roman" w:hAnsi="Times New Roman"/>
+                <w:color w:val="000000"/>
+                <w:sz w:val="24"/>
               </w:rPr>
-              <w:t>Đưa sản phẩm lên mạng cho thành viên xem</w:t>
+              <w:t>Đổi nhánh khẩn cấp</w:t>
             </w:r>
           </w:p>
         </w:tc>
@@ -3151,12 +2458,11 @@
         <w:tc>
           <w:tcPr>
             <w:tcW w:type="dxa" w:w="720"/>
-            <w:shd w:fill="F9FAFB"/>
             <w:tcMar>
-              <w:top w:w="100" w:type="dxa"/>
-              <w:bottom w:w="100" w:type="dxa"/>
-              <w:left w:w="140" w:type="dxa"/>
-              <w:right w:w="140" w:type="dxa"/>
+              <w:top w:w="80" w:type="dxa"/>
+              <w:bottom w:w="80" w:type="dxa"/>
+              <w:left w:w="120" w:type="dxa"/>
+              <w:right w:w="120" w:type="dxa"/>
             </w:tcMar>
           </w:tcPr>
           <w:p>
@@ -3166,9 +2472,9 @@
             </w:pPr>
             <w:r>
               <w:rPr>
-                <w:rFonts w:ascii="Arial" w:hAnsi="Arial"/>
-                <w:color w:val="333333"/>
-                <w:sz w:val="19"/>
+                <w:rFonts w:ascii="Times New Roman" w:hAnsi="Times New Roman"/>
+                <w:color w:val="000000"/>
+                <w:sz w:val="24"/>
               </w:rPr>
               <w:t>12</w:t>
             </w:r>
@@ -3177,12 +2483,11 @@
         <w:tc>
           <w:tcPr>
             <w:tcW w:type="dxa" w:w="2880"/>
-            <w:shd w:fill="F9FAFB"/>
             <w:tcMar>
-              <w:top w:w="100" w:type="dxa"/>
-              <w:bottom w:w="100" w:type="dxa"/>
-              <w:left w:w="140" w:type="dxa"/>
-              <w:right w:w="140" w:type="dxa"/>
+              <w:top w:w="80" w:type="dxa"/>
+              <w:bottom w:w="80" w:type="dxa"/>
+              <w:left w:w="120" w:type="dxa"/>
+              <w:right w:w="120" w:type="dxa"/>
             </w:tcMar>
           </w:tcPr>
           <w:p>
@@ -3191,24 +2496,23 @@
             </w:pPr>
             <w:r>
               <w:rPr>
-                <w:rFonts w:ascii="Consolas" w:hAnsi="Consolas"/>
+                <w:rFonts w:ascii="Times New Roman" w:hAnsi="Times New Roman"/>
                 <w:b/>
-                <w:color w:val="0969DA"/>
-                <w:sz w:val="19"/>
+                <w:color w:val="000000"/>
+                <w:sz w:val="24"/>
               </w:rPr>
-              <w:t>git pull origin &lt;branch&gt;</w:t>
+              <w:t>git stash pop</w:t>
             </w:r>
           </w:p>
         </w:tc>
         <w:tc>
           <w:tcPr>
             <w:tcW w:type="dxa" w:w="3168"/>
-            <w:shd w:fill="F9FAFB"/>
             <w:tcMar>
-              <w:top w:w="100" w:type="dxa"/>
-              <w:bottom w:w="100" w:type="dxa"/>
-              <w:left w:w="140" w:type="dxa"/>
-              <w:right w:w="140" w:type="dxa"/>
+              <w:top w:w="80" w:type="dxa"/>
+              <w:bottom w:w="80" w:type="dxa"/>
+              <w:left w:w="120" w:type="dxa"/>
+              <w:right w:w="120" w:type="dxa"/>
             </w:tcMar>
           </w:tcPr>
           <w:p>
@@ -3217,23 +2521,22 @@
             </w:pPr>
             <w:r>
               <w:rPr>
-                <w:rFonts w:ascii="Arial" w:hAnsi="Arial"/>
-                <w:color w:val="333333"/>
-                <w:sz w:val="19"/>
+                <w:rFonts w:ascii="Times New Roman" w:hAnsi="Times New Roman"/>
+                <w:color w:val="000000"/>
+                <w:sz w:val="24"/>
               </w:rPr>
-              <w:t>Kéo code mới nhất về máy</w:t>
+              <w:t>Lấy lại code đã cất</w:t>
             </w:r>
           </w:p>
         </w:tc>
         <w:tc>
           <w:tcPr>
             <w:tcW w:type="dxa" w:w="2592"/>
-            <w:shd w:fill="F9FAFB"/>
             <w:tcMar>
-              <w:top w:w="100" w:type="dxa"/>
-              <w:bottom w:w="100" w:type="dxa"/>
-              <w:left w:w="140" w:type="dxa"/>
-              <w:right w:w="140" w:type="dxa"/>
+              <w:top w:w="80" w:type="dxa"/>
+              <w:bottom w:w="80" w:type="dxa"/>
+              <w:left w:w="120" w:type="dxa"/>
+              <w:right w:w="120" w:type="dxa"/>
             </w:tcMar>
           </w:tcPr>
           <w:p>
@@ -3242,419 +2545,11 @@
             </w:pPr>
             <w:r>
               <w:rPr>
-                <w:rFonts w:ascii="Arial" w:hAnsi="Arial"/>
-                <w:color w:val="333333"/>
-                <w:sz w:val="19"/>
+                <w:rFonts w:ascii="Times New Roman" w:hAnsi="Times New Roman"/>
+                <w:color w:val="000000"/>
+                <w:sz w:val="24"/>
               </w:rPr>
-              <w:t>Đồng bộ mã nguồn của đồng nghiệp về máy mình</w:t>
-            </w:r>
-          </w:p>
-        </w:tc>
-      </w:tr>
-      <w:tr>
-        <w:tc>
-          <w:tcPr>
-            <w:tcW w:type="dxa" w:w="720"/>
-            <w:tcMar>
-              <w:top w:w="100" w:type="dxa"/>
-              <w:bottom w:w="100" w:type="dxa"/>
-              <w:left w:w="140" w:type="dxa"/>
-              <w:right w:w="140" w:type="dxa"/>
-            </w:tcMar>
-          </w:tcPr>
-          <w:p>
-            <w:pPr>
-              <w:spacing w:before="0" w:after="0" w:line="276" w:lineRule="auto"/>
-              <w:jc w:val="center"/>
-            </w:pPr>
-            <w:r>
-              <w:rPr>
-                <w:rFonts w:ascii="Arial" w:hAnsi="Arial"/>
-                <w:color w:val="333333"/>
-                <w:sz w:val="19"/>
-              </w:rPr>
-              <w:t>13</w:t>
-            </w:r>
-          </w:p>
-        </w:tc>
-        <w:tc>
-          <w:tcPr>
-            <w:tcW w:type="dxa" w:w="2880"/>
-            <w:tcMar>
-              <w:top w:w="100" w:type="dxa"/>
-              <w:bottom w:w="100" w:type="dxa"/>
-              <w:left w:w="140" w:type="dxa"/>
-              <w:right w:w="140" w:type="dxa"/>
-            </w:tcMar>
-          </w:tcPr>
-          <w:p>
-            <w:pPr>
-              <w:spacing w:before="0" w:after="0" w:line="276" w:lineRule="auto"/>
-            </w:pPr>
-            <w:r>
-              <w:rPr>
-                <w:rFonts w:ascii="Consolas" w:hAnsi="Consolas"/>
-                <w:b/>
-                <w:color w:val="0969DA"/>
-                <w:sz w:val="19"/>
-              </w:rPr>
-              <w:t>git stash</w:t>
-            </w:r>
-          </w:p>
-        </w:tc>
-        <w:tc>
-          <w:tcPr>
-            <w:tcW w:type="dxa" w:w="3168"/>
-            <w:tcMar>
-              <w:top w:w="100" w:type="dxa"/>
-              <w:bottom w:w="100" w:type="dxa"/>
-              <w:left w:w="140" w:type="dxa"/>
-              <w:right w:w="140" w:type="dxa"/>
-            </w:tcMar>
-          </w:tcPr>
-          <w:p>
-            <w:pPr>
-              <w:spacing w:before="0" w:after="0" w:line="276" w:lineRule="auto"/>
-            </w:pPr>
-            <w:r>
-              <w:rPr>
-                <w:rFonts w:ascii="Arial" w:hAnsi="Arial"/>
-                <w:color w:val="333333"/>
-                <w:sz w:val="19"/>
-              </w:rPr>
-              <w:t>Cất tạm code đang làm dở</w:t>
-            </w:r>
-          </w:p>
-        </w:tc>
-        <w:tc>
-          <w:tcPr>
-            <w:tcW w:type="dxa" w:w="2592"/>
-            <w:tcMar>
-              <w:top w:w="100" w:type="dxa"/>
-              <w:bottom w:w="100" w:type="dxa"/>
-              <w:left w:w="140" w:type="dxa"/>
-              <w:right w:w="140" w:type="dxa"/>
-            </w:tcMar>
-          </w:tcPr>
-          <w:p>
-            <w:pPr>
-              <w:spacing w:before="0" w:after="0" w:line="276" w:lineRule="auto"/>
-            </w:pPr>
-            <w:r>
-              <w:rPr>
-                <w:rFonts w:ascii="Arial" w:hAnsi="Arial"/>
-                <w:color w:val="333333"/>
-                <w:sz w:val="19"/>
-              </w:rPr>
-              <w:t>Cần đổi nhánh gấp khi code chưa xong</w:t>
-            </w:r>
-          </w:p>
-        </w:tc>
-      </w:tr>
-      <w:tr>
-        <w:tc>
-          <w:tcPr>
-            <w:tcW w:type="dxa" w:w="720"/>
-            <w:shd w:fill="F9FAFB"/>
-            <w:tcMar>
-              <w:top w:w="100" w:type="dxa"/>
-              <w:bottom w:w="100" w:type="dxa"/>
-              <w:left w:w="140" w:type="dxa"/>
-              <w:right w:w="140" w:type="dxa"/>
-            </w:tcMar>
-          </w:tcPr>
-          <w:p>
-            <w:pPr>
-              <w:spacing w:before="0" w:after="0" w:line="276" w:lineRule="auto"/>
-              <w:jc w:val="center"/>
-            </w:pPr>
-            <w:r>
-              <w:rPr>
-                <w:rFonts w:ascii="Arial" w:hAnsi="Arial"/>
-                <w:color w:val="333333"/>
-                <w:sz w:val="19"/>
-              </w:rPr>
-              <w:t>14</w:t>
-            </w:r>
-          </w:p>
-        </w:tc>
-        <w:tc>
-          <w:tcPr>
-            <w:tcW w:type="dxa" w:w="2880"/>
-            <w:shd w:fill="F9FAFB"/>
-            <w:tcMar>
-              <w:top w:w="100" w:type="dxa"/>
-              <w:bottom w:w="100" w:type="dxa"/>
-              <w:left w:w="140" w:type="dxa"/>
-              <w:right w:w="140" w:type="dxa"/>
-            </w:tcMar>
-          </w:tcPr>
-          <w:p>
-            <w:pPr>
-              <w:spacing w:before="0" w:after="0" w:line="276" w:lineRule="auto"/>
-            </w:pPr>
-            <w:r>
-              <w:rPr>
-                <w:rFonts w:ascii="Consolas" w:hAnsi="Consolas"/>
-                <w:b/>
-                <w:color w:val="0969DA"/>
-                <w:sz w:val="19"/>
-              </w:rPr>
-              <w:t>git stash pop</w:t>
-            </w:r>
-          </w:p>
-        </w:tc>
-        <w:tc>
-          <w:tcPr>
-            <w:tcW w:type="dxa" w:w="3168"/>
-            <w:shd w:fill="F9FAFB"/>
-            <w:tcMar>
-              <w:top w:w="100" w:type="dxa"/>
-              <w:bottom w:w="100" w:type="dxa"/>
-              <w:left w:w="140" w:type="dxa"/>
-              <w:right w:w="140" w:type="dxa"/>
-            </w:tcMar>
-          </w:tcPr>
-          <w:p>
-            <w:pPr>
-              <w:spacing w:before="0" w:after="0" w:line="276" w:lineRule="auto"/>
-            </w:pPr>
-            <w:r>
-              <w:rPr>
-                <w:rFonts w:ascii="Arial" w:hAnsi="Arial"/>
-                <w:color w:val="333333"/>
-                <w:sz w:val="19"/>
-              </w:rPr>
-              <w:t>Lấy lại code đã cất tạm</w:t>
-            </w:r>
-          </w:p>
-        </w:tc>
-        <w:tc>
-          <w:tcPr>
-            <w:tcW w:type="dxa" w:w="2592"/>
-            <w:shd w:fill="F9FAFB"/>
-            <w:tcMar>
-              <w:top w:w="100" w:type="dxa"/>
-              <w:bottom w:w="100" w:type="dxa"/>
-              <w:left w:w="140" w:type="dxa"/>
-              <w:right w:w="140" w:type="dxa"/>
-            </w:tcMar>
-          </w:tcPr>
-          <w:p>
-            <w:pPr>
-              <w:spacing w:before="0" w:after="0" w:line="276" w:lineRule="auto"/>
-            </w:pPr>
-            <w:r>
-              <w:rPr>
-                <w:rFonts w:ascii="Arial" w:hAnsi="Arial"/>
-                <w:color w:val="333333"/>
-                <w:sz w:val="19"/>
-              </w:rPr>
-              <w:t>Tiếp tục công việc dở dang sau khi chuyển nhánh</w:t>
-            </w:r>
-          </w:p>
-        </w:tc>
-      </w:tr>
-      <w:tr>
-        <w:tc>
-          <w:tcPr>
-            <w:tcW w:type="dxa" w:w="720"/>
-            <w:tcMar>
-              <w:top w:w="100" w:type="dxa"/>
-              <w:bottom w:w="100" w:type="dxa"/>
-              <w:left w:w="140" w:type="dxa"/>
-              <w:right w:w="140" w:type="dxa"/>
-            </w:tcMar>
-          </w:tcPr>
-          <w:p>
-            <w:pPr>
-              <w:spacing w:before="0" w:after="0" w:line="276" w:lineRule="auto"/>
-              <w:jc w:val="center"/>
-            </w:pPr>
-            <w:r>
-              <w:rPr>
-                <w:rFonts w:ascii="Arial" w:hAnsi="Arial"/>
-                <w:color w:val="333333"/>
-                <w:sz w:val="19"/>
-              </w:rPr>
-              <w:t>15</w:t>
-            </w:r>
-          </w:p>
-        </w:tc>
-        <w:tc>
-          <w:tcPr>
-            <w:tcW w:type="dxa" w:w="2880"/>
-            <w:tcMar>
-              <w:top w:w="100" w:type="dxa"/>
-              <w:bottom w:w="100" w:type="dxa"/>
-              <w:left w:w="140" w:type="dxa"/>
-              <w:right w:w="140" w:type="dxa"/>
-            </w:tcMar>
-          </w:tcPr>
-          <w:p>
-            <w:pPr>
-              <w:spacing w:before="0" w:after="0" w:line="276" w:lineRule="auto"/>
-            </w:pPr>
-            <w:r>
-              <w:rPr>
-                <w:rFonts w:ascii="Consolas" w:hAnsi="Consolas"/>
-                <w:b/>
-                <w:color w:val="0969DA"/>
-                <w:sz w:val="19"/>
-              </w:rPr>
-              <w:t>git restore &lt;file&gt;</w:t>
-            </w:r>
-          </w:p>
-        </w:tc>
-        <w:tc>
-          <w:tcPr>
-            <w:tcW w:type="dxa" w:w="3168"/>
-            <w:tcMar>
-              <w:top w:w="100" w:type="dxa"/>
-              <w:bottom w:w="100" w:type="dxa"/>
-              <w:left w:w="140" w:type="dxa"/>
-              <w:right w:w="140" w:type="dxa"/>
-            </w:tcMar>
-          </w:tcPr>
-          <w:p>
-            <w:pPr>
-              <w:spacing w:before="0" w:after="0" w:line="276" w:lineRule="auto"/>
-            </w:pPr>
-            <w:r>
-              <w:rPr>
-                <w:rFonts w:ascii="Arial" w:hAnsi="Arial"/>
-                <w:color w:val="333333"/>
-                <w:sz w:val="19"/>
-              </w:rPr>
-              <w:t>Hủy bỏ sửa đổi chưa lưu</w:t>
-            </w:r>
-          </w:p>
-        </w:tc>
-        <w:tc>
-          <w:tcPr>
-            <w:tcW w:type="dxa" w:w="2592"/>
-            <w:tcMar>
-              <w:top w:w="100" w:type="dxa"/>
-              <w:bottom w:w="100" w:type="dxa"/>
-              <w:left w:w="140" w:type="dxa"/>
-              <w:right w:w="140" w:type="dxa"/>
-            </w:tcMar>
-          </w:tcPr>
-          <w:p>
-            <w:pPr>
-              <w:spacing w:before="0" w:after="0" w:line="276" w:lineRule="auto"/>
-            </w:pPr>
-            <w:r>
-              <w:rPr>
-                <w:rFonts w:ascii="Arial" w:hAnsi="Arial"/>
-                <w:color w:val="333333"/>
-                <w:sz w:val="19"/>
-              </w:rPr>
-              <w:t>Phục hồi file về trạng thái commit gần nhất</w:t>
-            </w:r>
-          </w:p>
-        </w:tc>
-      </w:tr>
-      <w:tr>
-        <w:tc>
-          <w:tcPr>
-            <w:tcW w:type="dxa" w:w="720"/>
-            <w:shd w:fill="F9FAFB"/>
-            <w:tcMar>
-              <w:top w:w="100" w:type="dxa"/>
-              <w:bottom w:w="100" w:type="dxa"/>
-              <w:left w:w="140" w:type="dxa"/>
-              <w:right w:w="140" w:type="dxa"/>
-            </w:tcMar>
-          </w:tcPr>
-          <w:p>
-            <w:pPr>
-              <w:spacing w:before="0" w:after="0" w:line="276" w:lineRule="auto"/>
-              <w:jc w:val="center"/>
-            </w:pPr>
-            <w:r>
-              <w:rPr>
-                <w:rFonts w:ascii="Arial" w:hAnsi="Arial"/>
-                <w:color w:val="333333"/>
-                <w:sz w:val="19"/>
-              </w:rPr>
-              <w:t>16</w:t>
-            </w:r>
-          </w:p>
-        </w:tc>
-        <w:tc>
-          <w:tcPr>
-            <w:tcW w:type="dxa" w:w="2880"/>
-            <w:shd w:fill="F9FAFB"/>
-            <w:tcMar>
-              <w:top w:w="100" w:type="dxa"/>
-              <w:bottom w:w="100" w:type="dxa"/>
-              <w:left w:w="140" w:type="dxa"/>
-              <w:right w:w="140" w:type="dxa"/>
-            </w:tcMar>
-          </w:tcPr>
-          <w:p>
-            <w:pPr>
-              <w:spacing w:before="0" w:after="0" w:line="276" w:lineRule="auto"/>
-            </w:pPr>
-            <w:r>
-              <w:rPr>
-                <w:rFonts w:ascii="Consolas" w:hAnsi="Consolas"/>
-                <w:b/>
-                <w:color w:val="0969DA"/>
-                <w:sz w:val="19"/>
-              </w:rPr>
-              <w:t>git revert &lt;commit_id&gt;</w:t>
-            </w:r>
-          </w:p>
-        </w:tc>
-        <w:tc>
-          <w:tcPr>
-            <w:tcW w:type="dxa" w:w="3168"/>
-            <w:shd w:fill="F9FAFB"/>
-            <w:tcMar>
-              <w:top w:w="100" w:type="dxa"/>
-              <w:bottom w:w="100" w:type="dxa"/>
-              <w:left w:w="140" w:type="dxa"/>
-              <w:right w:w="140" w:type="dxa"/>
-            </w:tcMar>
-          </w:tcPr>
-          <w:p>
-            <w:pPr>
-              <w:spacing w:before="0" w:after="0" w:line="276" w:lineRule="auto"/>
-            </w:pPr>
-            <w:r>
-              <w:rPr>
-                <w:rFonts w:ascii="Arial" w:hAnsi="Arial"/>
-                <w:color w:val="333333"/>
-                <w:sz w:val="19"/>
-              </w:rPr>
-              <w:t>Đảo ngược commit sinh bug</w:t>
-            </w:r>
-          </w:p>
-        </w:tc>
-        <w:tc>
-          <w:tcPr>
-            <w:tcW w:type="dxa" w:w="2592"/>
-            <w:shd w:fill="F9FAFB"/>
-            <w:tcMar>
-              <w:top w:w="100" w:type="dxa"/>
-              <w:bottom w:w="100" w:type="dxa"/>
-              <w:left w:w="140" w:type="dxa"/>
-              <w:right w:w="140" w:type="dxa"/>
-            </w:tcMar>
-          </w:tcPr>
-          <w:p>
-            <w:pPr>
-              <w:spacing w:before="0" w:after="0" w:line="276" w:lineRule="auto"/>
-            </w:pPr>
-            <w:r>
-              <w:rPr>
-                <w:rFonts w:ascii="Arial" w:hAnsi="Arial"/>
-                <w:color w:val="333333"/>
-                <w:sz w:val="19"/>
-              </w:rPr>
-              <w:t>Hủy commit lỗi mà không làm hỏng lịch sử chung</w:t>
+              <w:t>Tiếp tục làm việc dở dang</w:t>
             </w:r>
           </w:p>
         </w:tc>
@@ -3662,35 +2557,22 @@
     </w:tbl>
     <w:p>
       <w:pPr>
-        <w:spacing w:after="120"/>
+        <w:spacing w:after="80"/>
       </w:pPr>
     </w:p>
     <w:p>
       <w:pPr>
         <w:keepNext/>
-        <w:spacing w:before="320" w:after="120"/>
+        <w:spacing w:before="280" w:after="80"/>
       </w:pPr>
       <w:r>
         <w:rPr>
-          <w:rFonts w:ascii="Arial" w:hAnsi="Arial"/>
+          <w:rFonts w:ascii="Times New Roman" w:hAnsi="Times New Roman"/>
           <w:b/>
-          <w:color w:val="1F4E79"/>
-          <w:sz w:val="27"/>
+          <w:color w:val="000000"/>
+          <w:sz w:val="30"/>
         </w:rPr>
-        <w:t>4. QUY TRÌNH PHỐI HỢP LÀM VIỆC CHUẨN TRÊN GITHUB (GITHUB FLOW)</w:t>
-      </w:r>
-    </w:p>
-    <w:p>
-      <w:pPr>
-        <w:spacing w:before="0" w:after="120" w:line="288" w:lineRule="auto"/>
-      </w:pPr>
-      <w:r>
-        <w:rPr>
-          <w:rFonts w:ascii="Arial" w:hAnsi="Arial"/>
-          <w:color w:val="222222"/>
-          <w:sz w:val="21"/>
-        </w:rPr>
-        <w:t>Quy trình GitHub Flow là tiêu chuẩn công nghiệp trong quản lý dự án phần mềm gồm 6 bước rõ ràng:</w:t>
+        <w:t>4. QUY TRÌNH LÀM VIỆC NHÓM TRÊN GITHUB (5 BƯỚC)</w:t>
       </w:r>
     </w:p>
     <w:p>
@@ -3700,19 +2582,20 @@
       </w:pPr>
       <w:r>
         <w:rPr>
-          <w:rFonts w:ascii="Arial" w:hAnsi="Arial"/>
+          <w:rFonts w:ascii="Times New Roman" w:hAnsi="Times New Roman"/>
           <w:b/>
-          <w:sz w:val="21"/>
+          <w:color w:val="000000"/>
+          <w:sz w:val="26"/>
         </w:rPr>
-        <w:t xml:space="preserve">1. Đồng bộ (Sync): </w:t>
+        <w:t xml:space="preserve">Bước 1 (Pull): </w:t>
       </w:r>
       <w:r>
         <w:rPr>
-          <w:rFonts w:ascii="Arial" w:hAnsi="Arial"/>
-          <w:color w:val="222222"/>
-          <w:sz w:val="21"/>
+          <w:rFonts w:ascii="Times New Roman" w:hAnsi="Times New Roman"/>
+          <w:color w:val="000000"/>
+          <w:sz w:val="26"/>
         </w:rPr>
-        <w:t>Luôn đồng bộ code mới nhất từ nhánh main trên GitHub về máy tính cá nhân bằng 'git pull origin main'.</w:t>
+        <w:t>Cập nhật nhánh main mới nhất từ GitHub về máy.</w:t>
       </w:r>
     </w:p>
     <w:p>
@@ -3722,19 +2605,20 @@
       </w:pPr>
       <w:r>
         <w:rPr>
-          <w:rFonts w:ascii="Arial" w:hAnsi="Arial"/>
+          <w:rFonts w:ascii="Times New Roman" w:hAnsi="Times New Roman"/>
           <w:b/>
-          <w:sz w:val="21"/>
+          <w:color w:val="000000"/>
+          <w:sz w:val="26"/>
         </w:rPr>
-        <w:t xml:space="preserve">2. Phân nhánh (Branch): </w:t>
+        <w:t xml:space="preserve">Bước 2 (Branch): </w:t>
       </w:r>
       <w:r>
         <w:rPr>
-          <w:rFonts w:ascii="Arial" w:hAnsi="Arial"/>
-          <w:color w:val="222222"/>
-          <w:sz w:val="21"/>
+          <w:rFonts w:ascii="Times New Roman" w:hAnsi="Times New Roman"/>
+          <w:color w:val="000000"/>
+          <w:sz w:val="26"/>
         </w:rPr>
-        <w:t>Tạo nhánh mới mang tên rõ ràng (ví dụ: feature/gui-login, bugfix/header-overflow) bằng lệnh 'git checkout -b feature/gui-login'.</w:t>
+        <w:t>Tạo nhánh tính năng riêng: git checkout -b feature-login.</w:t>
       </w:r>
     </w:p>
     <w:p>
@@ -3744,19 +2628,20 @@
       </w:pPr>
       <w:r>
         <w:rPr>
-          <w:rFonts w:ascii="Arial" w:hAnsi="Arial"/>
+          <w:rFonts w:ascii="Times New Roman" w:hAnsi="Times New Roman"/>
           <w:b/>
-          <w:sz w:val="21"/>
+          <w:color w:val="000000"/>
+          <w:sz w:val="26"/>
         </w:rPr>
-        <w:t xml:space="preserve">3. Lập trình &amp; Commit (Make changes): </w:t>
+        <w:t xml:space="preserve">Bước 3 (Commit): </w:t>
       </w:r>
       <w:r>
         <w:rPr>
-          <w:rFonts w:ascii="Arial" w:hAnsi="Arial"/>
-          <w:color w:val="222222"/>
-          <w:sz w:val="21"/>
+          <w:rFonts w:ascii="Times New Roman" w:hAnsi="Times New Roman"/>
+          <w:color w:val="000000"/>
+          <w:sz w:val="26"/>
         </w:rPr>
-        <w:t>Lập trình, lưu các commit nhỏ rõ ràng: 'git add .' -&gt; 'git commit -m "feat: create login UI"'.</w:t>
+        <w:t>Viết mã, sau đó commit: git add . &amp;&amp; git commit -m "add login".</w:t>
       </w:r>
     </w:p>
     <w:p>
@@ -3766,19 +2651,20 @@
       </w:pPr>
       <w:r>
         <w:rPr>
-          <w:rFonts w:ascii="Arial" w:hAnsi="Arial"/>
+          <w:rFonts w:ascii="Times New Roman" w:hAnsi="Times New Roman"/>
           <w:b/>
-          <w:sz w:val="21"/>
+          <w:color w:val="000000"/>
+          <w:sz w:val="26"/>
         </w:rPr>
-        <w:t xml:space="preserve">4. Đẩy nhánh (Push to Remote): </w:t>
+        <w:t xml:space="preserve">Bước 4 (Push): </w:t>
       </w:r>
       <w:r>
         <w:rPr>
-          <w:rFonts w:ascii="Arial" w:hAnsi="Arial"/>
-          <w:color w:val="222222"/>
-          <w:sz w:val="21"/>
+          <w:rFonts w:ascii="Times New Roman" w:hAnsi="Times New Roman"/>
+          <w:color w:val="000000"/>
+          <w:sz w:val="26"/>
         </w:rPr>
-        <w:t>Đẩy nhánh lên GitHub để nhóm theo dõi: 'git push -u origin feature/gui-login'.</w:t>
+        <w:t>Đẩy nhánh lên GitHub: git push -u origin feature-login.</w:t>
       </w:r>
     </w:p>
     <w:p>
@@ -3788,157 +2674,20 @@
       </w:pPr>
       <w:r>
         <w:rPr>
-          <w:rFonts w:ascii="Arial" w:hAnsi="Arial"/>
+          <w:rFonts w:ascii="Times New Roman" w:hAnsi="Times New Roman"/>
           <w:b/>
-          <w:sz w:val="21"/>
+          <w:color w:val="000000"/>
+          <w:sz w:val="26"/>
         </w:rPr>
-        <w:t xml:space="preserve">5. Tạo Pull Request (PR &amp; Code Review): </w:t>
+        <w:t xml:space="preserve">Bước 5 (PR &amp; Merge): </w:t>
       </w:r>
       <w:r>
         <w:rPr>
-          <w:rFonts w:ascii="Arial" w:hAnsi="Arial"/>
-          <w:color w:val="222222"/>
-          <w:sz w:val="21"/>
+          <w:rFonts w:ascii="Times New Roman" w:hAnsi="Times New Roman"/>
+          <w:color w:val="000000"/>
+          <w:sz w:val="26"/>
         </w:rPr>
-        <w:t>Trên web GitHub, mở Pull Request (PR) đề xuất gộp code vào main. Gắn tag Reviewer để rà soát code và thảo luận.</w:t>
-      </w:r>
-    </w:p>
-    <w:p>
-      <w:pPr>
-        <w:pStyle w:val="ListBullet"/>
-        <w:spacing w:before="0" w:after="60" w:line="276" w:lineRule="auto"/>
-      </w:pPr>
-      <w:r>
-        <w:rPr>
-          <w:rFonts w:ascii="Arial" w:hAnsi="Arial"/>
-          <w:b/>
-          <w:sz w:val="21"/>
-        </w:rPr>
-        <w:t xml:space="preserve">6. Hợp nhất &amp; Triển khai (Merge &amp; Deploy): </w:t>
-      </w:r>
-      <w:r>
-        <w:rPr>
-          <w:rFonts w:ascii="Arial" w:hAnsi="Arial"/>
-          <w:color w:val="222222"/>
-          <w:sz w:val="21"/>
-        </w:rPr>
-        <w:t>Sau khi code được duyệt và CI/CD kiểm thử thành công, nhấn 'Merge pull request'. Nhánh hoàn tất sẽ được xóa sạch.</w:t>
-      </w:r>
-    </w:p>
-    <w:p>
-      <w:pPr>
-        <w:keepNext/>
-        <w:spacing w:before="320" w:after="120"/>
-      </w:pPr>
-      <w:r>
-        <w:rPr>
-          <w:rFonts w:ascii="Arial" w:hAnsi="Arial"/>
-          <w:b/>
-          <w:color w:val="1F4E79"/>
-          <w:sz w:val="27"/>
-        </w:rPr>
-        <w:t>5. KẾT LUẬN VÀ Ý NGHĨA TRONG MÔN HỌC</w:t>
-      </w:r>
-    </w:p>
-    <w:p>
-      <w:pPr>
-        <w:spacing w:before="0" w:after="120" w:line="288" w:lineRule="auto"/>
-      </w:pPr>
-      <w:r>
-        <w:rPr>
-          <w:rFonts w:ascii="Arial" w:hAnsi="Arial"/>
-          <w:color w:val="222222"/>
-          <w:sz w:val="21"/>
-        </w:rPr>
-        <w:t>Việc kết hợp thành thạo giữa công cụ dòng lệnh Git và nền tảng cộng tác GitHub mang lại những lợi ích cốt lõi cho kỹ sư phần mềm:</w:t>
-      </w:r>
-    </w:p>
-    <w:p>
-      <w:pPr>
-        <w:pStyle w:val="ListBullet"/>
-        <w:spacing w:before="0" w:after="60" w:line="276" w:lineRule="auto"/>
-      </w:pPr>
-      <w:r>
-        <w:rPr>
-          <w:rFonts w:ascii="Arial" w:hAnsi="Arial"/>
-          <w:b/>
-          <w:sz w:val="21"/>
-        </w:rPr>
-        <w:t xml:space="preserve">Kiểm soát tuyệt đối mã nguồn: </w:t>
-      </w:r>
-      <w:r>
-        <w:rPr>
-          <w:rFonts w:ascii="Arial" w:hAnsi="Arial"/>
-          <w:color w:val="222222"/>
-          <w:sz w:val="21"/>
-        </w:rPr>
-        <w:t>Mọi thay đổi đều được lưu lại và có thể phục hồi ngay lập tức, không bao giờ lo mất dữ liệu hay lỗi phiên bản.</w:t>
-      </w:r>
-    </w:p>
-    <w:p>
-      <w:pPr>
-        <w:pStyle w:val="ListBullet"/>
-        <w:spacing w:before="0" w:after="60" w:line="276" w:lineRule="auto"/>
-      </w:pPr>
-      <w:r>
-        <w:rPr>
-          <w:rFonts w:ascii="Arial" w:hAnsi="Arial"/>
-          <w:b/>
-          <w:sz w:val="21"/>
-        </w:rPr>
-        <w:t xml:space="preserve">Tối ưu hóa khả năng làm việc nhóm: </w:t>
-      </w:r>
-      <w:r>
-        <w:rPr>
-          <w:rFonts w:ascii="Arial" w:hAnsi="Arial"/>
-          <w:color w:val="222222"/>
-          <w:sz w:val="21"/>
-        </w:rPr>
-        <w:t>Hỗ trợ hàng chục lập trình viên cùng làm việc đồng thời trên nhiều nhánh mà không ghi đè lên nhau.</w:t>
-      </w:r>
-    </w:p>
-    <w:p>
-      <w:pPr>
-        <w:pStyle w:val="ListBullet"/>
-        <w:spacing w:before="0" w:after="60" w:line="276" w:lineRule="auto"/>
-      </w:pPr>
-      <w:r>
-        <w:rPr>
-          <w:rFonts w:ascii="Arial" w:hAnsi="Arial"/>
-          <w:b/>
-          <w:sz w:val="21"/>
-        </w:rPr>
-        <w:t xml:space="preserve">Nâng cao chất lượng phần mềm: </w:t>
-      </w:r>
-      <w:r>
-        <w:rPr>
-          <w:rFonts w:ascii="Arial" w:hAnsi="Arial"/>
-          <w:color w:val="222222"/>
-          <w:sz w:val="21"/>
-        </w:rPr>
-        <w:t>Pull Request và Code Review giúp phát hiện bug sớm, chuẩn hóa phong cách viết code trong toàn đội ngũ.</w:t>
-      </w:r>
-    </w:p>
-    <w:p>
-      <w:pPr>
-        <w:pStyle w:val="ListBullet"/>
-        <w:spacing w:before="0" w:after="60" w:line="276" w:lineRule="auto"/>
-      </w:pPr>
-      <w:r>
-        <w:rPr>
-          <w:rFonts w:ascii="Arial" w:hAnsi="Arial"/>
-          <w:b/>
-          <w:sz w:val="21"/>
-        </w:rPr>
-        <w:t xml:space="preserve">Tích hợp CI/CD tự động: </w:t>
-      </w:r>
-      <w:r>
-        <w:rPr>
-          <w:rFonts w:ascii="Arial" w:hAnsi="Arial"/>
-          <w:color w:val="222222"/>
-          <w:sz w:val="21"/>
-        </w:rPr>
-        <w:t>Dễ dàng kết nối với các quy trình tự động hóa kiểm thử, đóng gói và phát hành phần mềm hiện đại.</w:t>
+        <w:t>Tạo Pull Request trên GitHub, để đồng đội review và gộp (merge) vào main.</w:t>
       </w:r>
     </w:p>
     <w:sectPr>
@@ -4314,6 +3063,11 @@
     <w:name w:val="Normal"/>
     <w:qFormat/>
     <w:rsid w:val="00FC693F"/>
+    <w:rPr>
+      <w:rFonts w:ascii="Times New Roman" w:hAnsi="Times New Roman"/>
+      <w:color w:val="000000"/>
+      <w:sz w:val="26"/>
+    </w:rPr>
   </w:style>
   <w:style w:type="paragraph" w:styleId="Header">
     <w:name w:val="header"/>

</xml_diff>